<commit_message>
Governance: no-secrets rule with hooks, AWS account/profile page, supply-chain trust plan, backlog
- CLAUDE.md, /no-secrets skill and scripts/check_no_secrets.py enforced by a Claude Code PreToolUse hook and .githooks pre-commit/pre-push
- docs: NO_SECRETS_IN_GIT, AWS_ACCOUNT_AND_PROFILE, SUPPLY_CHAIN_TRUST (SBOM, provenance, AI-BOM), BACKLOG (BL-01/02)
- Activate Overall Roadmap 1.5: supply-chain trust added to the section 5 backlog and the 1.3 mapping

Co-Authored-By: Claude Fable 5.1 <noreply@anthropic.com>
</commit_message>
<xml_diff>
--- a/docs/AI platform /Activate_AI_Platform_Overall_Roadmap.docx
+++ b/docs/AI platform /Activate_AI_Platform_Overall_Roadmap.docx
@@ -65,7 +65,7 @@
           <w:bCs/>
           <w:color w:val="595959"/>
         </w:rPr>
-        <w:t>Release: 1.4 (Draft for review) – additions (†) from the RESPONSIBLE-AI-ENTERPRISEREADY roadmap review (2 October 2026): gateway admin console, scoped gateway settings, AI App–AI Gateway integration contract with build-time credentials and token exchange, guided configuration and configuration copilot, LiteLLM capability discovery, admin audit view; dedicated proxy per silo tenant added to the backlog; mapping in section 1.3; sections 2–5 recalculated; 1.3: Activate team second revision: Phase 0 gateway items (provider abstraction to cache analytics) set to 0 MD; Phase 1 generic knowledge and analytics tools set to 8 MD (2 / 1 / 5); sections 3–5 recalculated and reviewed; 1.2: section 2.1 revised by the Activate team (scope moves and per-feature design and testing), reviewed and carried through all sections; LiteLLM detailed design additions (†) re-estimated against the revised items; Phases 3–4 re-estimated where LiteLLM provides the capability; 1.1: Phase 0 additions; 1.0: first issue</w:t>
+        <w:t>Release: 1.5 (Draft for review) – supply-chain trust for AI-assisted delivery (signed SBOM, build provenance, AI-BOM; RESPONSIBLE-AI backlog BL-01 and BL-02, 3 October 2026) added as a section 5 backlog row and to the 1.3 mapping; section 5 total recalculated; sections 2–4 unchanged; 1.4: additions (†) from the RESPONSIBLE-AI-ENTERPRISEREADY roadmap review (2 October 2026): gateway admin console, scoped gateway settings, AI App–AI Gateway integration contract with build-time credentials and token exchange, guided configuration and configuration copilot, LiteLLM capability discovery, admin audit view; dedicated proxy per silo tenant added to the backlog; mapping in section 1.3; sections 2–5 recalculated; 1.3: Activate team second revision: Phase 0 gateway items (provider abstraction to cache analytics) set to 0 MD; Phase 1 generic knowledge and analytics tools set to 8 MD (2 / 1 / 5); sections 3–5 recalculated and reviewed; 1.2: section 2.1 revised by the Activate team (scope moves and per-feature design and testing), reviewed and carried through all sections; LiteLLM detailed design additions (†) re-estimated against the revised items; Phases 3–4 re-estimated where LiteLLM provides the capability; 1.1: Phase 0 additions; 1.0: first issue</w:t>
       </w:r>
       <w:r/>
       <w:proofErr w:type="spellStart"/>
@@ -87,11 +87,9 @@
           <w:bCs/>
           <w:color w:val="595959"/>
         </w:rPr>
-        <w:t xml:space="preserve">Date: </w:t>
+        <w:t>Date: 3 October 2026</w:t>
       </w:r>
-      <w:r>
-        <w:t>2 October 2026</w:t>
-      </w:r>
+      <w:r/>
     </w:p>
     <w:p>
       <w:pPr>
@@ -119,7 +117,7 @@
           <w:bCs/>
           <w:color w:val="595959"/>
         </w:rPr>
-        <w:t>Sources: Activate Roadmap Timeline slide (Phases 0–4); AI Gateway Recommended Architecture v1.7; AI App Platform Recommended Architecture v1.5; AI Gateway LiteLLM Detailed Design v1.1; RESPONSIBLE-AI-ENTERPRISEREADY roadmap and Proxy Manager enterprise design (2 Oct 2026)</w:t>
+        <w:t>Sources: Activate Roadmap Timeline slide (Phases 0–4); AI Gateway Recommended Architecture v1.7; AI App Platform Recommended Architecture v1.5; AI Gateway LiteLLM Detailed Design v1.1; RESPONSIBLE-AI-ENTERPRISEREADY roadmap and Proxy Manager enterprise design (2 Oct 2026); RESPONSIBLE-AI supply-chain trust proposal, SUPPLY_CHAIN_TRUST.md (3 Oct 2026)</w:t>
       </w:r>
       <w:r/>
       <w:proofErr w:type="spellStart"/>
@@ -4912,6 +4910,135 @@
                 <w:szCs w:val="16"/>
               </w:rPr>
               <w:t>12</w:t>
+            </w:r>
+          </w:p>
+        </w:tc>
+        <w:tc>
+          <w:tcPr>
+            <w:tcW w:w="5680" w:type="dxa"/>
+            <w:tcBorders>
+              <w:top w:val="single" w:sz="4" w:space="0" w:color="8497B0"/>
+              <w:left w:val="single" w:sz="4" w:space="0" w:color="8497B0"/>
+              <w:bottom w:val="single" w:sz="4" w:space="0" w:color="8497B0"/>
+              <w:right w:val="single" w:sz="4" w:space="0" w:color="8497B0"/>
+            </w:tcBorders>
+            <w:tcMar>
+              <w:top w:w="60" w:type="dxa"/>
+              <w:left w:w="100" w:type="dxa"/>
+              <w:bottom w:w="60" w:type="dxa"/>
+              <w:right w:w="100" w:type="dxa"/>
+            </w:tcMar>
+          </w:tcPr>
+          <w:p>
+            <w:pPr>
+              <w:spacing w:after="40"/>
+            </w:pPr>
+            <w:r>
+              <w:rPr>
+                <w:sz w:val="16"/>
+                <w:szCs w:val="16"/>
+              </w:rPr>
+              <w:t>New backlog row</w:t>
+            </w:r>
+          </w:p>
+        </w:tc>
+      </w:tr>
+      <w:tr>
+        <w:tblPrEx>
+          <w:tblCellMar>
+            <w:top w:w="0" w:type="dxa"/>
+            <w:bottom w:w="0" w:type="dxa"/>
+          </w:tblCellMar>
+        </w:tblPrEx>
+        <w:trPr>
+          <w:cantSplit/>
+        </w:trPr>
+        <w:tc>
+          <w:tcPr>
+            <w:tcW w:w="3000" w:type="dxa"/>
+            <w:tcBorders>
+              <w:top w:val="single" w:sz="4" w:space="0" w:color="8497B0"/>
+              <w:left w:val="single" w:sz="4" w:space="0" w:color="8497B0"/>
+              <w:bottom w:val="single" w:sz="4" w:space="0" w:color="8497B0"/>
+              <w:right w:val="single" w:sz="4" w:space="0" w:color="8497B0"/>
+            </w:tcBorders>
+            <w:tcMar>
+              <w:top w:w="60" w:type="dxa"/>
+              <w:left w:w="100" w:type="dxa"/>
+              <w:bottom w:w="60" w:type="dxa"/>
+              <w:right w:w="100" w:type="dxa"/>
+            </w:tcMar>
+          </w:tcPr>
+          <w:p>
+            <w:pPr>
+              <w:spacing w:after="40"/>
+            </w:pPr>
+            <w:proofErr w:type="spellStart"/>
+            <w:r>
+              <w:rPr>
+                <w:sz w:val="16"/>
+                <w:szCs w:val="16"/>
+              </w:rPr>
+              <w:t>Supply-chain trust: signed SBOM, SLSA build provenance, VEX and AI-BOM for every release on a reproducible build (recorded in the RESPONSIBLE-AI backlog as BL-01 and BL-02, 3 October 2026)</w:t>
+            </w:r>
+            <w:proofErr w:type="spellEnd"/>
+          </w:p>
+        </w:tc>
+        <w:tc>
+          <w:tcPr>
+            <w:tcW w:w="2600" w:type="dxa"/>
+            <w:tcBorders>
+              <w:top w:val="single" w:sz="4" w:space="0" w:color="8497B0"/>
+              <w:left w:val="single" w:sz="4" w:space="0" w:color="8497B0"/>
+              <w:bottom w:val="single" w:sz="4" w:space="0" w:color="8497B0"/>
+              <w:right w:val="single" w:sz="4" w:space="0" w:color="8497B0"/>
+            </w:tcBorders>
+            <w:tcMar>
+              <w:top w:w="60" w:type="dxa"/>
+              <w:left w:w="100" w:type="dxa"/>
+              <w:bottom w:w="60" w:type="dxa"/>
+              <w:right w:w="100" w:type="dxa"/>
+            </w:tcMar>
+          </w:tcPr>
+          <w:p>
+            <w:pPr>
+              <w:spacing w:after="40"/>
+            </w:pPr>
+            <w:r>
+              <w:rPr>
+                <w:sz w:val="16"/>
+                <w:szCs w:val="16"/>
+              </w:rPr>
+              <w:t>Section 5 backlog</w:t>
+            </w:r>
+          </w:p>
+        </w:tc>
+        <w:tc>
+          <w:tcPr>
+            <w:tcW w:w="2400" w:type="dxa"/>
+            <w:tcBorders>
+              <w:top w:val="single" w:sz="4" w:space="0" w:color="8497B0"/>
+              <w:left w:val="single" w:sz="4" w:space="0" w:color="8497B0"/>
+              <w:bottom w:val="single" w:sz="4" w:space="0" w:color="8497B0"/>
+              <w:right w:val="single" w:sz="4" w:space="0" w:color="8497B0"/>
+            </w:tcBorders>
+            <w:tcMar>
+              <w:top w:w="60" w:type="dxa"/>
+              <w:left w:w="100" w:type="dxa"/>
+              <w:bottom w:w="60" w:type="dxa"/>
+              <w:right w:w="100" w:type="dxa"/>
+            </w:tcMar>
+          </w:tcPr>
+          <w:p>
+            <w:pPr>
+              <w:spacing w:after="40"/>
+            </w:pPr>
+            <w:r>
+              <w:rPr>
+                <w:sz w:val="16"/>
+                <w:szCs w:val="16"/>
+              </w:rPr>
+              <w:t>11</w:t>
             </w:r>
           </w:p>
         </w:tc>
@@ -31526,6 +31653,104 @@
               <w:bottom w:val="single" w:sz="4" w:space="0" w:color="8497B0"/>
               <w:right w:val="single" w:sz="4" w:space="0" w:color="8497B0"/>
             </w:tcBorders>
+            <w:tcMar>
+              <w:top w:w="60" w:type="dxa"/>
+              <w:left w:w="100" w:type="dxa"/>
+              <w:bottom w:w="60" w:type="dxa"/>
+              <w:right w:w="100" w:type="dxa"/>
+            </w:tcMar>
+          </w:tcPr>
+          <w:p>
+            <w:pPr>
+              <w:spacing w:after="40"/>
+            </w:pPr>
+            <w:r>
+              <w:rPr>
+                <w:sz w:val="16"/>
+                <w:szCs w:val="16"/>
+              </w:rPr>
+              <w:t>Supply-chain trust for AI-assisted delivery: reproducible build (hash-pinned dependencies, base image by digest, vendor checksums), signed CycloneDX SBOM and SLSA build provenance on every release, vulnerability scan with VEX statements, AI-BOM of models, guardrails and judges, customer verification guide (RESPONSIBLE-AI BACKLOG.md BL-01 and BL-02)</w:t>
+            </w:r>
+          </w:p>
+        </w:tc>
+        <w:tc>
+          <w:tcPr>
+            <w:tcW w:w="2400" w:type="dxa"/>
+            <w:tcBorders>
+              <w:top w:val="single" w:sz="4" w:space="0" w:color="8497B0"/>
+              <w:left w:val="single" w:sz="4" w:space="0" w:color="8497B0"/>
+              <w:bottom w:val="single" w:sz="4" w:space="0" w:color="8497B0"/>
+              <w:right w:val="single" w:sz="4" w:space="0" w:color="8497B0"/>
+            </w:tcBorders>
+            <w:tcMar>
+              <w:top w:w="60" w:type="dxa"/>
+              <w:left w:w="100" w:type="dxa"/>
+              <w:bottom w:w="60" w:type="dxa"/>
+              <w:right w:w="100" w:type="dxa"/>
+            </w:tcMar>
+          </w:tcPr>
+          <w:p>
+            <w:pPr>
+              <w:spacing w:after="40"/>
+            </w:pPr>
+            <w:r>
+              <w:rPr>
+                <w:sz w:val="16"/>
+                <w:szCs w:val="16"/>
+              </w:rPr>
+              <w:t>Shared core</w:t>
+            </w:r>
+          </w:p>
+        </w:tc>
+        <w:tc>
+          <w:tcPr>
+            <w:tcW w:w="2480" w:type="dxa"/>
+            <w:tcBorders>
+              <w:top w:val="single" w:sz="4" w:space="0" w:color="8497B0"/>
+              <w:left w:val="single" w:sz="4" w:space="0" w:color="8497B0"/>
+              <w:bottom w:val="single" w:sz="4" w:space="0" w:color="8497B0"/>
+              <w:right w:val="single" w:sz="4" w:space="0" w:color="8497B0"/>
+            </w:tcBorders>
+            <w:tcMar>
+              <w:top w:w="60" w:type="dxa"/>
+              <w:left w:w="100" w:type="dxa"/>
+              <w:bottom w:w="60" w:type="dxa"/>
+              <w:right w:w="100" w:type="dxa"/>
+            </w:tcMar>
+          </w:tcPr>
+          <w:p>
+            <w:pPr>
+              <w:spacing w:after="40"/>
+            </w:pPr>
+            <w:r>
+              <w:rPr>
+                <w:sz w:val="16"/>
+                <w:szCs w:val="16"/>
+              </w:rPr>
+              <w:t>11</w:t>
+            </w:r>
+          </w:p>
+        </w:tc>
+      </w:tr>
+      <w:tr>
+        <w:tblPrEx>
+          <w:tblCellMar>
+            <w:top w:w="0" w:type="dxa"/>
+            <w:bottom w:w="0" w:type="dxa"/>
+          </w:tblCellMar>
+        </w:tblPrEx>
+        <w:trPr>
+          <w:cantSplit/>
+        </w:trPr>
+        <w:tc>
+          <w:tcPr>
+            <w:tcW w:w="8800" w:type="dxa"/>
+            <w:tcBorders>
+              <w:top w:val="single" w:sz="4" w:space="0" w:color="8497B0"/>
+              <w:left w:val="single" w:sz="4" w:space="0" w:color="8497B0"/>
+              <w:bottom w:val="single" w:sz="4" w:space="0" w:color="8497B0"/>
+              <w:right w:val="single" w:sz="4" w:space="0" w:color="8497B0"/>
+            </w:tcBorders>
             <w:shd w:val="clear" w:color="auto" w:fill="EEF1F5"/>
             <w:tcMar>
               <w:top w:w="60" w:type="dxa"/>
@@ -31596,7 +31821,7 @@
                 <w:sz w:val="16"/>
                 <w:szCs w:val="16"/>
               </w:rPr>
-              <w:t>480</w:t>
+              <w:t>491</w:t>
             </w:r>
           </w:p>
         </w:tc>
@@ -31607,7 +31832,7 @@
         <w:spacing w:before="120" w:after="120" w:line="264" w:lineRule="auto"/>
       </w:pPr>
       <w:r>
-        <w:t>Phases 0–4 (≈ 321.8 MD) plus the backlog (≈ 480 MD) gives about 801.8 MD to the full platform vision with AI-assisted delivery.</w:t>
+        <w:t>Phases 0–4 (≈ 321.8 MD) plus the backlog (≈ 491 MD) gives about 812.8 MD to the full platform vision with AI-assisted delivery.</w:t>
       </w:r>
     </w:p>
     <w:sectPr>

</xml_diff>

<commit_message>
Deploy: dev gateway image 0aa6c16; Workflow Studio verified in AWS (Studio 23/23, apps 23/23)
- infra/live/dev/ecs-ai-gateway image_tag 0aa6c16 (task definition :10, ACTIVEPIECES_PUBLIC_URL removed).
- Frontend bundle uploaded and CloudFront invalidated.
- Docs: ACTIVEPIECES_INTEGRATION §10a (Studio verification, defects found), ROADMAP WS-3 and M17 done,
  TECH_DEBT TD-30 closing on the operator destroy of the legacy engine API, snapshot addendum.

Co-Authored-By: Claude Fable 5.1 <noreply@anthropic.com>
</commit_message>
<xml_diff>
--- a/docs/AI platform /Activate_AI_Platform_Overall_Roadmap.docx
+++ b/docs/AI platform /Activate_AI_Platform_Overall_Roadmap.docx
@@ -65,6 +65,19 @@
           <w:bCs/>
           <w:color w:val="595959"/>
         </w:rPr>
+        <w:t>Release: 1.6 (Draft for review) – Workflow Studio: the workflow builder moves into the Activate portal over the engine API; the engine becomes an internal backend with no public URL (RESPONSIBLE-AI-ENTERPRISEREADY roadmap, Sprints WS-1 to WS-3, delivered 2026-10-03 in the reference implementation). Three † rows added to Phase 2 (31 MD of features plus 3.1 MD product management); mapping in section 1.3; sections 1.2, 3 and 4 recalculated; section 5 unchanged.</w:t>
+      </w:r>
+    </w:p>
+    <w:p>
+      <w:pPr>
+        <w:spacing w:after="80"/>
+      </w:pPr>
+      <w:r>
+        <w:rPr>
+          <w:b/>
+          <w:bCs/>
+          <w:color w:val="595959"/>
+        </w:rPr>
         <w:t>Release: 1.5 (Draft for review) – supply-chain trust for AI-assisted delivery (signed SBOM, build provenance, AI-BOM; RESPONSIBLE-AI backlog BL-01 and BL-02, 3 October 2026) added as a section 5 backlog row and to the 1.3 mapping; section 5 total recalculated; sections 2–4 unchanged; 1.4: additions (†) from the RESPONSIBLE-AI-ENTERPRISEREADY roadmap review (2 October 2026): gateway admin console, scoped gateway settings, AI App–AI Gateway integration contract with build-time credentials and token exchange, guided configuration and configuration copilot, LiteLLM capability discovery, admin audit view; dedicated proxy per silo tenant added to the backlog; mapping in section 1.3; sections 2–5 recalculated; 1.3: Activate team second revision: Phase 0 gateway items (provider abstraction to cache analytics) set to 0 MD; Phase 1 generic knowledge and analytics tools set to 8 MD (2 / 1 / 5); sections 3–5 recalculated and reviewed; 1.2: section 2.1 revised by the Activate team (scope moves and per-feature design and testing), reviewed and carried through all sections; LiteLLM detailed design additions (†) re-estimated against the revised items; Phases 3–4 re-estimated where LiteLLM provides the capability; 1.1: Phase 0 additions; 1.0: first issue</w:t>
       </w:r>
       <w:r/>
@@ -117,7 +130,7 @@
           <w:bCs/>
           <w:color w:val="595959"/>
         </w:rPr>
-        <w:t>Sources: Activate Roadmap Timeline slide (Phases 0–4); AI Gateway Recommended Architecture v1.7; AI App Platform Recommended Architecture v1.5; AI Gateway LiteLLM Detailed Design v1.1; RESPONSIBLE-AI-ENTERPRISEREADY roadmap and Proxy Manager enterprise design (2 Oct 2026); RESPONSIBLE-AI supply-chain trust proposal, SUPPLY_CHAIN_TRUST.md (3 Oct 2026)</w:t>
+        <w:t>Sources: Activate Roadmap Timeline slide (Phases 0–4); AI Gateway Recommended Architecture v1.7; AI App Platform Recommended Architecture v1.5; AI Gateway LiteLLM Detailed Design v1.1; RESPONSIBLE-AI-ENTERPRISEREADY roadmap and Proxy Manager enterprise design (2 Oct 2026); RESPONSIBLE-AI supply-chain trust proposal, SUPPLY_CHAIN_TRUST.md (3 Oct 2026); RESPONSIBLE-AI Workflow Studio plan, WORKFLOW_STUDIO_PLAN.md, and roadmap Sprints WS-1 to WS-3 (3 Oct 2026)</w:t>
       </w:r>
       <w:r/>
       <w:proofErr w:type="spellStart"/>
@@ -2873,6 +2886,133 @@
           </w:p>
         </w:tc>
       </w:tr>
+      <w:tr>
+        <w:tblPrEx>
+          <w:tblCellMar>
+            <w:top w:w="0" w:type="dxa"/>
+            <w:bottom w:w="0" w:type="dxa"/>
+          </w:tblCellMar>
+        </w:tblPrEx>
+        <w:trPr>
+          <w:cantSplit/>
+        </w:trPr>
+        <w:tc>
+          <w:tcPr>
+            <w:tcW w:w="3000" w:type="dxa"/>
+            <w:tcBorders>
+              <w:top w:val="single" w:sz="4" w:space="0" w:color="8497B0"/>
+              <w:left w:val="single" w:sz="4" w:space="0" w:color="8497B0"/>
+              <w:bottom w:val="single" w:sz="4" w:space="0" w:color="8497B0"/>
+              <w:right w:val="single" w:sz="4" w:space="0" w:color="8497B0"/>
+            </w:tcBorders>
+            <w:tcMar>
+              <w:top w:w="60" w:type="dxa"/>
+              <w:left w:w="100" w:type="dxa"/>
+              <w:bottom w:w="60" w:type="dxa"/>
+              <w:right w:w="100" w:type="dxa"/>
+            </w:tcMar>
+          </w:tcPr>
+          <w:p>
+            <w:pPr>
+              <w:spacing w:after="40"/>
+            </w:pPr>
+            <w:r>
+              <w:rPr>
+                <w:sz w:val="16"/>
+                <w:szCs w:val="16"/>
+              </w:rPr>
+              <w:t>Total itemised MD, Phases 0–4 (incl. product management)</w:t>
+            </w:r>
+          </w:p>
+        </w:tc>
+        <w:tc>
+          <w:tcPr>
+            <w:tcW w:w="2600" w:type="dxa"/>
+            <w:tcBorders>
+              <w:top w:val="single" w:sz="4" w:space="0" w:color="8497B0"/>
+              <w:left w:val="single" w:sz="4" w:space="0" w:color="8497B0"/>
+              <w:bottom w:val="single" w:sz="4" w:space="0" w:color="8497B0"/>
+              <w:right w:val="single" w:sz="4" w:space="0" w:color="8497B0"/>
+            </w:tcBorders>
+            <w:tcMar>
+              <w:top w:w="60" w:type="dxa"/>
+              <w:left w:w="100" w:type="dxa"/>
+              <w:bottom w:w="60" w:type="dxa"/>
+              <w:right w:w="100" w:type="dxa"/>
+            </w:tcMar>
+          </w:tcPr>
+          <w:p>
+            <w:pPr>
+              <w:spacing w:after="40"/>
+            </w:pPr>
+            <w:r>
+              <w:rPr>
+                <w:sz w:val="16"/>
+                <w:szCs w:val="16"/>
+              </w:rPr>
+              <w:t>321.8 MD</w:t>
+            </w:r>
+          </w:p>
+        </w:tc>
+        <w:tc>
+          <w:tcPr>
+            <w:tcW w:w="2400" w:type="dxa"/>
+            <w:tcBorders>
+              <w:top w:val="single" w:sz="4" w:space="0" w:color="8497B0"/>
+              <w:left w:val="single" w:sz="4" w:space="0" w:color="8497B0"/>
+              <w:bottom w:val="single" w:sz="4" w:space="0" w:color="8497B0"/>
+              <w:right w:val="single" w:sz="4" w:space="0" w:color="8497B0"/>
+            </w:tcBorders>
+            <w:tcMar>
+              <w:top w:w="60" w:type="dxa"/>
+              <w:left w:w="100" w:type="dxa"/>
+              <w:bottom w:w="60" w:type="dxa"/>
+              <w:right w:w="100" w:type="dxa"/>
+            </w:tcMar>
+          </w:tcPr>
+          <w:p>
+            <w:pPr>
+              <w:spacing w:after="40"/>
+            </w:pPr>
+            <w:r>
+              <w:rPr>
+                <w:sz w:val="16"/>
+                <w:szCs w:val="16"/>
+              </w:rPr>
+              <w:t>355.9 MD</w:t>
+            </w:r>
+          </w:p>
+        </w:tc>
+        <w:tc>
+          <w:tcPr>
+            <w:tcW w:w="5680" w:type="dxa"/>
+            <w:tcBorders>
+              <w:top w:val="single" w:sz="4" w:space="0" w:color="8497B0"/>
+              <w:left w:val="single" w:sz="4" w:space="0" w:color="8497B0"/>
+              <w:bottom w:val="single" w:sz="4" w:space="0" w:color="8497B0"/>
+              <w:right w:val="single" w:sz="4" w:space="0" w:color="8497B0"/>
+            </w:tcBorders>
+            <w:tcMar>
+              <w:top w:w="60" w:type="dxa"/>
+              <w:left w:w="100" w:type="dxa"/>
+              <w:bottom w:w="60" w:type="dxa"/>
+              <w:right w:w="100" w:type="dxa"/>
+            </w:tcMar>
+          </w:tcPr>
+          <w:p>
+            <w:pPr>
+              <w:spacing w:after="40"/>
+            </w:pPr>
+            <w:r>
+              <w:rPr>
+                <w:sz w:val="16"/>
+                <w:szCs w:val="16"/>
+              </w:rPr>
+              <w:t>Workflow Studio † rows in Phase 2 (release 1.6): 31 MD of features plus 3.1 MD product management</w:t>
+            </w:r>
+          </w:p>
+        </w:tc>
+      </w:tr>
     </w:tbl>
     <w:p>
       <w:pPr>
@@ -4804,6 +4944,387 @@
                 <w:szCs w:val="16"/>
               </w:rPr>
               <w:t>Covered</w:t>
+            </w:r>
+          </w:p>
+        </w:tc>
+      </w:tr>
+      <w:tr>
+        <w:tblPrEx>
+          <w:tblCellMar>
+            <w:top w:w="0" w:type="dxa"/>
+            <w:bottom w:w="0" w:type="dxa"/>
+          </w:tblCellMar>
+        </w:tblPrEx>
+        <w:trPr>
+          <w:cantSplit/>
+        </w:trPr>
+        <w:tc>
+          <w:tcPr>
+            <w:tcW w:w="3000" w:type="dxa"/>
+            <w:tcBorders>
+              <w:top w:val="single" w:sz="4" w:space="0" w:color="8497B0"/>
+              <w:left w:val="single" w:sz="4" w:space="0" w:color="8497B0"/>
+              <w:bottom w:val="single" w:sz="4" w:space="0" w:color="8497B0"/>
+              <w:right w:val="single" w:sz="4" w:space="0" w:color="8497B0"/>
+            </w:tcBorders>
+            <w:tcMar>
+              <w:top w:w="60" w:type="dxa"/>
+              <w:left w:w="100" w:type="dxa"/>
+              <w:bottom w:w="60" w:type="dxa"/>
+              <w:right w:w="100" w:type="dxa"/>
+            </w:tcMar>
+          </w:tcPr>
+          <w:p>
+            <w:pPr>
+              <w:spacing w:after="40"/>
+            </w:pPr>
+            <w:r>
+              <w:rPr>
+                <w:sz w:val="16"/>
+                <w:szCs w:val="16"/>
+              </w:rPr>
+              <w:t>Workflow Studio WS-1 – flow builder inside the Activate portal over the workflow engine API (step tree, property forms from piece metadata, connections, step test, publish); no engine login or engine URL in the user journey</w:t>
+            </w:r>
+          </w:p>
+        </w:tc>
+        <w:tc>
+          <w:tcPr>
+            <w:tcW w:w="2600" w:type="dxa"/>
+            <w:tcBorders>
+              <w:top w:val="single" w:sz="4" w:space="0" w:color="8497B0"/>
+              <w:left w:val="single" w:sz="4" w:space="0" w:color="8497B0"/>
+              <w:bottom w:val="single" w:sz="4" w:space="0" w:color="8497B0"/>
+              <w:right w:val="single" w:sz="4" w:space="0" w:color="8497B0"/>
+            </w:tcBorders>
+            <w:tcMar>
+              <w:top w:w="60" w:type="dxa"/>
+              <w:left w:w="100" w:type="dxa"/>
+              <w:bottom w:w="60" w:type="dxa"/>
+              <w:right w:w="100" w:type="dxa"/>
+            </w:tcMar>
+          </w:tcPr>
+          <w:p>
+            <w:pPr>
+              <w:spacing w:after="40"/>
+            </w:pPr>
+            <w:r>
+              <w:rPr>
+                <w:sz w:val="16"/>
+                <w:szCs w:val="16"/>
+              </w:rPr>
+              <w:t>Phase 2 row 9 Workflow Studio – portal-native flow builder</w:t>
+            </w:r>
+          </w:p>
+        </w:tc>
+        <w:tc>
+          <w:tcPr>
+            <w:tcW w:w="2400" w:type="dxa"/>
+            <w:tcBorders>
+              <w:top w:val="single" w:sz="4" w:space="0" w:color="8497B0"/>
+              <w:left w:val="single" w:sz="4" w:space="0" w:color="8497B0"/>
+              <w:bottom w:val="single" w:sz="4" w:space="0" w:color="8497B0"/>
+              <w:right w:val="single" w:sz="4" w:space="0" w:color="8497B0"/>
+            </w:tcBorders>
+            <w:tcMar>
+              <w:top w:w="60" w:type="dxa"/>
+              <w:left w:w="100" w:type="dxa"/>
+              <w:bottom w:w="60" w:type="dxa"/>
+              <w:right w:w="100" w:type="dxa"/>
+            </w:tcMar>
+          </w:tcPr>
+          <w:p>
+            <w:pPr>
+              <w:spacing w:after="40"/>
+            </w:pPr>
+            <w:r>
+              <w:rPr>
+                <w:sz w:val="16"/>
+                <w:szCs w:val="16"/>
+              </w:rPr>
+              <w:t>14</w:t>
+            </w:r>
+          </w:p>
+        </w:tc>
+        <w:tc>
+          <w:tcPr>
+            <w:tcW w:w="5680" w:type="dxa"/>
+            <w:tcBorders>
+              <w:top w:val="single" w:sz="4" w:space="0" w:color="8497B0"/>
+              <w:left w:val="single" w:sz="4" w:space="0" w:color="8497B0"/>
+              <w:bottom w:val="single" w:sz="4" w:space="0" w:color="8497B0"/>
+              <w:right w:val="single" w:sz="4" w:space="0" w:color="8497B0"/>
+            </w:tcBorders>
+            <w:tcMar>
+              <w:top w:w="60" w:type="dxa"/>
+              <w:left w:w="100" w:type="dxa"/>
+              <w:bottom w:w="60" w:type="dxa"/>
+              <w:right w:w="100" w:type="dxa"/>
+            </w:tcMar>
+          </w:tcPr>
+          <w:p>
+            <w:pPr>
+              <w:spacing w:after="40"/>
+            </w:pPr>
+            <w:r>
+              <w:rPr>
+                <w:sz w:val="16"/>
+                <w:szCs w:val="16"/>
+              </w:rPr>
+              <w:t>New † row</w:t>
+            </w:r>
+          </w:p>
+        </w:tc>
+      </w:tr>
+      <w:tr>
+        <w:tblPrEx>
+          <w:tblCellMar>
+            <w:top w:w="0" w:type="dxa"/>
+            <w:bottom w:w="0" w:type="dxa"/>
+          </w:tblCellMar>
+        </w:tblPrEx>
+        <w:trPr>
+          <w:cantSplit/>
+        </w:trPr>
+        <w:tc>
+          <w:tcPr>
+            <w:tcW w:w="3000" w:type="dxa"/>
+            <w:tcBorders>
+              <w:top w:val="single" w:sz="4" w:space="0" w:color="8497B0"/>
+              <w:left w:val="single" w:sz="4" w:space="0" w:color="8497B0"/>
+              <w:bottom w:val="single" w:sz="4" w:space="0" w:color="8497B0"/>
+              <w:right w:val="single" w:sz="4" w:space="0" w:color="8497B0"/>
+            </w:tcBorders>
+            <w:tcMar>
+              <w:top w:w="60" w:type="dxa"/>
+              <w:left w:w="100" w:type="dxa"/>
+              <w:bottom w:w="60" w:type="dxa"/>
+              <w:right w:w="100" w:type="dxa"/>
+            </w:tcMar>
+          </w:tcPr>
+          <w:p>
+            <w:pPr>
+              <w:spacing w:after="40"/>
+            </w:pPr>
+            <w:r>
+              <w:rPr>
+                <w:sz w:val="16"/>
+                <w:szCs w:val="16"/>
+              </w:rPr>
+              <w:t>Workflow Studio WS-2 – run history with per-step input/output and retry, template gallery, data picker, flow versions, curated piece catalogue</w:t>
+            </w:r>
+          </w:p>
+        </w:tc>
+        <w:tc>
+          <w:tcPr>
+            <w:tcW w:w="2600" w:type="dxa"/>
+            <w:tcBorders>
+              <w:top w:val="single" w:sz="4" w:space="0" w:color="8497B0"/>
+              <w:left w:val="single" w:sz="4" w:space="0" w:color="8497B0"/>
+              <w:bottom w:val="single" w:sz="4" w:space="0" w:color="8497B0"/>
+              <w:right w:val="single" w:sz="4" w:space="0" w:color="8497B0"/>
+            </w:tcBorders>
+            <w:tcMar>
+              <w:top w:w="60" w:type="dxa"/>
+              <w:left w:w="100" w:type="dxa"/>
+              <w:bottom w:w="60" w:type="dxa"/>
+              <w:right w:w="100" w:type="dxa"/>
+            </w:tcMar>
+          </w:tcPr>
+          <w:p>
+            <w:pPr>
+              <w:spacing w:after="40"/>
+            </w:pPr>
+            <w:r>
+              <w:rPr>
+                <w:sz w:val="16"/>
+                <w:szCs w:val="16"/>
+              </w:rPr>
+              <w:t>Phase 2 row 10 Workflow Studio – runs, templates, versions</w:t>
+            </w:r>
+          </w:p>
+        </w:tc>
+        <w:tc>
+          <w:tcPr>
+            <w:tcW w:w="2400" w:type="dxa"/>
+            <w:tcBorders>
+              <w:top w:val="single" w:sz="4" w:space="0" w:color="8497B0"/>
+              <w:left w:val="single" w:sz="4" w:space="0" w:color="8497B0"/>
+              <w:bottom w:val="single" w:sz="4" w:space="0" w:color="8497B0"/>
+              <w:right w:val="single" w:sz="4" w:space="0" w:color="8497B0"/>
+            </w:tcBorders>
+            <w:tcMar>
+              <w:top w:w="60" w:type="dxa"/>
+              <w:left w:w="100" w:type="dxa"/>
+              <w:bottom w:w="60" w:type="dxa"/>
+              <w:right w:w="100" w:type="dxa"/>
+            </w:tcMar>
+          </w:tcPr>
+          <w:p>
+            <w:pPr>
+              <w:spacing w:after="40"/>
+            </w:pPr>
+            <w:r>
+              <w:rPr>
+                <w:sz w:val="16"/>
+                <w:szCs w:val="16"/>
+              </w:rPr>
+              <w:t>8</w:t>
+            </w:r>
+          </w:p>
+        </w:tc>
+        <w:tc>
+          <w:tcPr>
+            <w:tcW w:w="5680" w:type="dxa"/>
+            <w:tcBorders>
+              <w:top w:val="single" w:sz="4" w:space="0" w:color="8497B0"/>
+              <w:left w:val="single" w:sz="4" w:space="0" w:color="8497B0"/>
+              <w:bottom w:val="single" w:sz="4" w:space="0" w:color="8497B0"/>
+              <w:right w:val="single" w:sz="4" w:space="0" w:color="8497B0"/>
+            </w:tcBorders>
+            <w:tcMar>
+              <w:top w:w="60" w:type="dxa"/>
+              <w:left w:w="100" w:type="dxa"/>
+              <w:bottom w:w="60" w:type="dxa"/>
+              <w:right w:w="100" w:type="dxa"/>
+            </w:tcMar>
+          </w:tcPr>
+          <w:p>
+            <w:pPr>
+              <w:spacing w:after="40"/>
+            </w:pPr>
+            <w:r>
+              <w:rPr>
+                <w:sz w:val="16"/>
+                <w:szCs w:val="16"/>
+              </w:rPr>
+              <w:t>New † row</w:t>
+            </w:r>
+          </w:p>
+        </w:tc>
+      </w:tr>
+      <w:tr>
+        <w:tblPrEx>
+          <w:tblCellMar>
+            <w:top w:w="0" w:type="dxa"/>
+            <w:bottom w:w="0" w:type="dxa"/>
+          </w:tblCellMar>
+        </w:tblPrEx>
+        <w:trPr>
+          <w:cantSplit/>
+        </w:trPr>
+        <w:tc>
+          <w:tcPr>
+            <w:tcW w:w="3000" w:type="dxa"/>
+            <w:tcBorders>
+              <w:top w:val="single" w:sz="4" w:space="0" w:color="8497B0"/>
+              <w:left w:val="single" w:sz="4" w:space="0" w:color="8497B0"/>
+              <w:bottom w:val="single" w:sz="4" w:space="0" w:color="8497B0"/>
+              <w:right w:val="single" w:sz="4" w:space="0" w:color="8497B0"/>
+            </w:tcBorders>
+            <w:tcMar>
+              <w:top w:w="60" w:type="dxa"/>
+              <w:left w:w="100" w:type="dxa"/>
+              <w:bottom w:w="60" w:type="dxa"/>
+              <w:right w:w="100" w:type="dxa"/>
+            </w:tcMar>
+          </w:tcPr>
+          <w:p>
+            <w:pPr>
+              <w:spacing w:after="40"/>
+            </w:pPr>
+            <w:r>
+              <w:rPr>
+                <w:sz w:val="16"/>
+                <w:szCs w:val="16"/>
+              </w:rPr>
+              <w:t>Workflow Studio WS-3 – engine internal only (no public URL or iframe), router / loop / code steps, OAuth2 connections via the portal callback</w:t>
+            </w:r>
+          </w:p>
+        </w:tc>
+        <w:tc>
+          <w:tcPr>
+            <w:tcW w:w="2600" w:type="dxa"/>
+            <w:tcBorders>
+              <w:top w:val="single" w:sz="4" w:space="0" w:color="8497B0"/>
+              <w:left w:val="single" w:sz="4" w:space="0" w:color="8497B0"/>
+              <w:bottom w:val="single" w:sz="4" w:space="0" w:color="8497B0"/>
+              <w:right w:val="single" w:sz="4" w:space="0" w:color="8497B0"/>
+            </w:tcBorders>
+            <w:tcMar>
+              <w:top w:w="60" w:type="dxa"/>
+              <w:left w:w="100" w:type="dxa"/>
+              <w:bottom w:w="60" w:type="dxa"/>
+              <w:right w:w="100" w:type="dxa"/>
+            </w:tcMar>
+          </w:tcPr>
+          <w:p>
+            <w:pPr>
+              <w:spacing w:after="40"/>
+            </w:pPr>
+            <w:r>
+              <w:rPr>
+                <w:sz w:val="16"/>
+                <w:szCs w:val="16"/>
+              </w:rPr>
+              <w:t>Phase 2 row 11 Workflow Studio – engine internal, router/loop/code, OAuth2</w:t>
+            </w:r>
+          </w:p>
+        </w:tc>
+        <w:tc>
+          <w:tcPr>
+            <w:tcW w:w="2400" w:type="dxa"/>
+            <w:tcBorders>
+              <w:top w:val="single" w:sz="4" w:space="0" w:color="8497B0"/>
+              <w:left w:val="single" w:sz="4" w:space="0" w:color="8497B0"/>
+              <w:bottom w:val="single" w:sz="4" w:space="0" w:color="8497B0"/>
+              <w:right w:val="single" w:sz="4" w:space="0" w:color="8497B0"/>
+            </w:tcBorders>
+            <w:tcMar>
+              <w:top w:w="60" w:type="dxa"/>
+              <w:left w:w="100" w:type="dxa"/>
+              <w:bottom w:w="60" w:type="dxa"/>
+              <w:right w:w="100" w:type="dxa"/>
+            </w:tcMar>
+          </w:tcPr>
+          <w:p>
+            <w:pPr>
+              <w:spacing w:after="40"/>
+            </w:pPr>
+            <w:r>
+              <w:rPr>
+                <w:sz w:val="16"/>
+                <w:szCs w:val="16"/>
+              </w:rPr>
+              <w:t>9</w:t>
+            </w:r>
+          </w:p>
+        </w:tc>
+        <w:tc>
+          <w:tcPr>
+            <w:tcW w:w="5680" w:type="dxa"/>
+            <w:tcBorders>
+              <w:top w:val="single" w:sz="4" w:space="0" w:color="8497B0"/>
+              <w:left w:val="single" w:sz="4" w:space="0" w:color="8497B0"/>
+              <w:bottom w:val="single" w:sz="4" w:space="0" w:color="8497B0"/>
+              <w:right w:val="single" w:sz="4" w:space="0" w:color="8497B0"/>
+            </w:tcBorders>
+            <w:tcMar>
+              <w:top w:w="60" w:type="dxa"/>
+              <w:left w:w="100" w:type="dxa"/>
+              <w:bottom w:w="60" w:type="dxa"/>
+              <w:right w:w="100" w:type="dxa"/>
+            </w:tcMar>
+          </w:tcPr>
+          <w:p>
+            <w:pPr>
+              <w:spacing w:after="40"/>
+            </w:pPr>
+            <w:r>
+              <w:rPr>
+                <w:sz w:val="16"/>
+                <w:szCs w:val="16"/>
+              </w:rPr>
+              <w:t>New † row</w:t>
             </w:r>
           </w:p>
         </w:tc>
@@ -14815,7 +15336,6 @@
               <w:bottom w:val="single" w:sz="4" w:space="0" w:color="8497B0"/>
               <w:right w:val="single" w:sz="4" w:space="0" w:color="8497B0"/>
             </w:tcBorders>
-            <w:shd w:val="clear" w:color="auto" w:fill="EEF1F5"/>
             <w:tcMar>
               <w:top w:w="60" w:type="dxa"/>
               <w:left w:w="100" w:type="dxa"/>
@@ -14845,24 +15365,23 @@
               <w:bottom w:val="single" w:sz="4" w:space="0" w:color="8497B0"/>
               <w:right w:val="single" w:sz="4" w:space="0" w:color="8497B0"/>
             </w:tcBorders>
-            <w:shd w:val="clear" w:color="auto" w:fill="EEF1F5"/>
-            <w:tcMar>
-              <w:top w:w="60" w:type="dxa"/>
-              <w:left w:w="100" w:type="dxa"/>
-              <w:bottom w:w="60" w:type="dxa"/>
-              <w:right w:w="100" w:type="dxa"/>
-            </w:tcMar>
-          </w:tcPr>
-          <w:p>
-            <w:pPr>
-              <w:spacing w:after="40"/>
-            </w:pPr>
-            <w:r>
-              <w:rPr>
-                <w:sz w:val="16"/>
-                <w:szCs w:val="16"/>
-              </w:rPr>
-              <w:t>Continuous architecture, design, testing</w:t>
+            <w:tcMar>
+              <w:top w:w="60" w:type="dxa"/>
+              <w:left w:w="100" w:type="dxa"/>
+              <w:bottom w:w="60" w:type="dxa"/>
+              <w:right w:w="100" w:type="dxa"/>
+            </w:tcMar>
+          </w:tcPr>
+          <w:p>
+            <w:pPr>
+              <w:spacing w:after="40"/>
+            </w:pPr>
+            <w:r>
+              <w:rPr>
+                <w:sz w:val="16"/>
+                <w:szCs w:val="16"/>
+              </w:rPr>
+              <w:t>Workflow Studio – portal-native flow builder over the workflow engine API (step tree, property forms from piece metadata, connections, step test, publish) †</w:t>
             </w:r>
           </w:p>
         </w:tc>
@@ -14875,24 +15394,23 @@
               <w:bottom w:val="single" w:sz="4" w:space="0" w:color="8497B0"/>
               <w:right w:val="single" w:sz="4" w:space="0" w:color="8497B0"/>
             </w:tcBorders>
-            <w:shd w:val="clear" w:color="auto" w:fill="EEF1F5"/>
-            <w:tcMar>
-              <w:top w:w="60" w:type="dxa"/>
-              <w:left w:w="100" w:type="dxa"/>
-              <w:bottom w:w="60" w:type="dxa"/>
-              <w:right w:w="100" w:type="dxa"/>
-            </w:tcMar>
-          </w:tcPr>
-          <w:p>
-            <w:pPr>
-              <w:spacing w:after="40"/>
-            </w:pPr>
-            <w:r>
-              <w:rPr>
-                <w:sz w:val="16"/>
-                <w:szCs w:val="16"/>
-              </w:rPr>
-              <w:t>Shared (continuous)</w:t>
+            <w:tcMar>
+              <w:top w:w="60" w:type="dxa"/>
+              <w:left w:w="100" w:type="dxa"/>
+              <w:bottom w:w="60" w:type="dxa"/>
+              <w:right w:w="100" w:type="dxa"/>
+            </w:tcMar>
+          </w:tcPr>
+          <w:p>
+            <w:pPr>
+              <w:spacing w:after="40"/>
+            </w:pPr>
+            <w:r>
+              <w:rPr>
+                <w:sz w:val="16"/>
+                <w:szCs w:val="16"/>
+              </w:rPr>
+              <w:t>AI Apps</w:t>
             </w:r>
           </w:p>
         </w:tc>
@@ -14905,7 +15423,6 @@
               <w:bottom w:val="single" w:sz="4" w:space="0" w:color="8497B0"/>
               <w:right w:val="single" w:sz="4" w:space="0" w:color="8497B0"/>
             </w:tcBorders>
-            <w:shd w:val="clear" w:color="auto" w:fill="EEF1F5"/>
             <w:tcMar>
               <w:top w:w="60" w:type="dxa"/>
               <w:left w:w="100" w:type="dxa"/>
@@ -14935,24 +15452,23 @@
               <w:bottom w:val="single" w:sz="4" w:space="0" w:color="8497B0"/>
               <w:right w:val="single" w:sz="4" w:space="0" w:color="8497B0"/>
             </w:tcBorders>
-            <w:shd w:val="clear" w:color="auto" w:fill="EEF1F5"/>
-            <w:tcMar>
-              <w:top w:w="60" w:type="dxa"/>
-              <w:left w:w="100" w:type="dxa"/>
-              <w:bottom w:w="60" w:type="dxa"/>
-              <w:right w:w="100" w:type="dxa"/>
-            </w:tcMar>
-          </w:tcPr>
-          <w:p>
-            <w:pPr>
-              <w:spacing w:after="40"/>
-            </w:pPr>
-            <w:r>
-              <w:rPr>
-                <w:sz w:val="16"/>
-                <w:szCs w:val="16"/>
-              </w:rPr>
-              <w:t>2</w:t>
+            <w:tcMar>
+              <w:top w:w="60" w:type="dxa"/>
+              <w:left w:w="100" w:type="dxa"/>
+              <w:bottom w:w="60" w:type="dxa"/>
+              <w:right w:w="100" w:type="dxa"/>
+            </w:tcMar>
+          </w:tcPr>
+          <w:p>
+            <w:pPr>
+              <w:spacing w:after="40"/>
+            </w:pPr>
+            <w:r>
+              <w:rPr>
+                <w:sz w:val="16"/>
+                <w:szCs w:val="16"/>
+              </w:rPr>
+              <w:t>8</w:t>
             </w:r>
           </w:p>
         </w:tc>
@@ -14965,24 +15481,23 @@
               <w:bottom w:val="single" w:sz="4" w:space="0" w:color="8497B0"/>
               <w:right w:val="single" w:sz="4" w:space="0" w:color="8497B0"/>
             </w:tcBorders>
-            <w:shd w:val="clear" w:color="auto" w:fill="EEF1F5"/>
-            <w:tcMar>
-              <w:top w:w="60" w:type="dxa"/>
-              <w:left w:w="100" w:type="dxa"/>
-              <w:bottom w:w="60" w:type="dxa"/>
-              <w:right w:w="100" w:type="dxa"/>
-            </w:tcMar>
-          </w:tcPr>
-          <w:p>
-            <w:pPr>
-              <w:spacing w:after="40"/>
-            </w:pPr>
-            <w:r>
-              <w:rPr>
-                <w:sz w:val="16"/>
-                <w:szCs w:val="16"/>
-              </w:rPr>
-              <w:t>4</w:t>
+            <w:tcMar>
+              <w:top w:w="60" w:type="dxa"/>
+              <w:left w:w="100" w:type="dxa"/>
+              <w:bottom w:w="60" w:type="dxa"/>
+              <w:right w:w="100" w:type="dxa"/>
+            </w:tcMar>
+          </w:tcPr>
+          <w:p>
+            <w:pPr>
+              <w:spacing w:after="40"/>
+            </w:pPr>
+            <w:r>
+              <w:rPr>
+                <w:sz w:val="16"/>
+                <w:szCs w:val="16"/>
+              </w:rPr>
+              <w:t>3</w:t>
             </w:r>
           </w:p>
         </w:tc>
@@ -14995,7 +15510,6 @@
               <w:bottom w:val="single" w:sz="4" w:space="0" w:color="8497B0"/>
               <w:right w:val="single" w:sz="4" w:space="0" w:color="8497B0"/>
             </w:tcBorders>
-            <w:shd w:val="clear" w:color="auto" w:fill="EEF1F5"/>
             <w:tcMar>
               <w:top w:w="60" w:type="dxa"/>
               <w:left w:w="100" w:type="dxa"/>
@@ -15025,24 +15539,23 @@
               <w:bottom w:val="single" w:sz="4" w:space="0" w:color="8497B0"/>
               <w:right w:val="single" w:sz="4" w:space="0" w:color="8497B0"/>
             </w:tcBorders>
-            <w:shd w:val="clear" w:color="auto" w:fill="EEF1F5"/>
-            <w:tcMar>
-              <w:top w:w="60" w:type="dxa"/>
-              <w:left w:w="100" w:type="dxa"/>
-              <w:bottom w:w="60" w:type="dxa"/>
-              <w:right w:w="100" w:type="dxa"/>
-            </w:tcMar>
-          </w:tcPr>
-          <w:p>
-            <w:pPr>
-              <w:spacing w:after="40"/>
-            </w:pPr>
-            <w:r>
-              <w:rPr>
-                <w:sz w:val="16"/>
-                <w:szCs w:val="16"/>
-              </w:rPr>
-              <w:t>9</w:t>
+            <w:tcMar>
+              <w:top w:w="60" w:type="dxa"/>
+              <w:left w:w="100" w:type="dxa"/>
+              <w:bottom w:w="60" w:type="dxa"/>
+              <w:right w:w="100" w:type="dxa"/>
+            </w:tcMar>
+          </w:tcPr>
+          <w:p>
+            <w:pPr>
+              <w:spacing w:after="40"/>
+            </w:pPr>
+            <w:r>
+              <w:rPr>
+                <w:sz w:val="16"/>
+                <w:szCs w:val="16"/>
+              </w:rPr>
+              <w:t>14</w:t>
             </w:r>
           </w:p>
         </w:tc>
@@ -15077,6 +15590,13 @@
             <w:pPr>
               <w:spacing w:after="40"/>
             </w:pPr>
+            <w:r>
+              <w:rPr>
+                <w:sz w:val="16"/>
+                <w:szCs w:val="16"/>
+              </w:rPr>
+              <w:t>10</w:t>
+            </w:r>
           </w:p>
         </w:tc>
         <w:tc>
@@ -15104,7 +15624,7 @@
                 <w:sz w:val="16"/>
                 <w:szCs w:val="16"/>
               </w:rPr>
-              <w:t>Product management (10% of phase effort)</w:t>
+              <w:t>Workflow Studio – runs with per-step input/output and retry, template gallery, data picker, versions, curated piece catalogue †</w:t>
             </w:r>
           </w:p>
         </w:tc>
@@ -15133,7 +15653,7 @@
                 <w:sz w:val="16"/>
                 <w:szCs w:val="16"/>
               </w:rPr>
-              <w:t>Programme</w:t>
+              <w:t>AI Apps</w:t>
             </w:r>
           </w:p>
         </w:tc>
@@ -15162,99 +15682,99 @@
                 <w:sz w:val="16"/>
                 <w:szCs w:val="16"/>
               </w:rPr>
+              <w:t>1</w:t>
+            </w:r>
+          </w:p>
+        </w:tc>
+        <w:tc>
+          <w:tcPr>
+            <w:tcW w:w="1300" w:type="dxa"/>
+            <w:tcBorders>
+              <w:top w:val="single" w:sz="4" w:space="0" w:color="8497B0"/>
+              <w:left w:val="single" w:sz="4" w:space="0" w:color="8497B0"/>
+              <w:bottom w:val="single" w:sz="4" w:space="0" w:color="8497B0"/>
+              <w:right w:val="single" w:sz="4" w:space="0" w:color="8497B0"/>
+            </w:tcBorders>
+            <w:tcMar>
+              <w:top w:w="60" w:type="dxa"/>
+              <w:left w:w="100" w:type="dxa"/>
+              <w:bottom w:w="60" w:type="dxa"/>
+              <w:right w:w="100" w:type="dxa"/>
+            </w:tcMar>
+          </w:tcPr>
+          <w:p>
+            <w:pPr>
+              <w:spacing w:after="40"/>
+            </w:pPr>
+            <w:r>
+              <w:rPr>
+                <w:sz w:val="16"/>
+                <w:szCs w:val="16"/>
+              </w:rPr>
+              <w:t>5</w:t>
+            </w:r>
+          </w:p>
+        </w:tc>
+        <w:tc>
+          <w:tcPr>
+            <w:tcW w:w="1100" w:type="dxa"/>
+            <w:tcBorders>
+              <w:top w:val="single" w:sz="4" w:space="0" w:color="8497B0"/>
+              <w:left w:val="single" w:sz="4" w:space="0" w:color="8497B0"/>
+              <w:bottom w:val="single" w:sz="4" w:space="0" w:color="8497B0"/>
+              <w:right w:val="single" w:sz="4" w:space="0" w:color="8497B0"/>
+            </w:tcBorders>
+            <w:tcMar>
+              <w:top w:w="60" w:type="dxa"/>
+              <w:left w:w="100" w:type="dxa"/>
+              <w:bottom w:w="60" w:type="dxa"/>
+              <w:right w:w="100" w:type="dxa"/>
+            </w:tcMar>
+          </w:tcPr>
+          <w:p>
+            <w:pPr>
+              <w:spacing w:after="40"/>
+            </w:pPr>
+            <w:r>
+              <w:rPr>
+                <w:sz w:val="16"/>
+                <w:szCs w:val="16"/>
+              </w:rPr>
+              <w:t>2</w:t>
+            </w:r>
+          </w:p>
+        </w:tc>
+        <w:tc>
+          <w:tcPr>
+            <w:tcW w:w="1300" w:type="dxa"/>
+            <w:tcBorders>
+              <w:top w:val="single" w:sz="4" w:space="0" w:color="8497B0"/>
+              <w:left w:val="single" w:sz="4" w:space="0" w:color="8497B0"/>
+              <w:bottom w:val="single" w:sz="4" w:space="0" w:color="8497B0"/>
+              <w:right w:val="single" w:sz="4" w:space="0" w:color="8497B0"/>
+            </w:tcBorders>
+            <w:tcMar>
+              <w:top w:w="60" w:type="dxa"/>
+              <w:left w:w="100" w:type="dxa"/>
+              <w:bottom w:w="60" w:type="dxa"/>
+              <w:right w:w="100" w:type="dxa"/>
+            </w:tcMar>
+          </w:tcPr>
+          <w:p>
+            <w:pPr>
+              <w:spacing w:after="40"/>
+            </w:pPr>
+            <w:r>
+              <w:rPr>
+                <w:sz w:val="16"/>
+                <w:szCs w:val="16"/>
+              </w:rPr>
               <w:t>–</w:t>
             </w:r>
           </w:p>
         </w:tc>
         <w:tc>
           <w:tcPr>
-            <w:tcW w:w="1300" w:type="dxa"/>
-            <w:tcBorders>
-              <w:top w:val="single" w:sz="4" w:space="0" w:color="8497B0"/>
-              <w:left w:val="single" w:sz="4" w:space="0" w:color="8497B0"/>
-              <w:bottom w:val="single" w:sz="4" w:space="0" w:color="8497B0"/>
-              <w:right w:val="single" w:sz="4" w:space="0" w:color="8497B0"/>
-            </w:tcBorders>
-            <w:tcMar>
-              <w:top w:w="60" w:type="dxa"/>
-              <w:left w:w="100" w:type="dxa"/>
-              <w:bottom w:w="60" w:type="dxa"/>
-              <w:right w:w="100" w:type="dxa"/>
-            </w:tcMar>
-          </w:tcPr>
-          <w:p>
-            <w:pPr>
-              <w:spacing w:after="40"/>
-            </w:pPr>
-            <w:r>
-              <w:rPr>
-                <w:sz w:val="16"/>
-                <w:szCs w:val="16"/>
-              </w:rPr>
-              <w:t>–</w:t>
-            </w:r>
-          </w:p>
-        </w:tc>
-        <w:tc>
-          <w:tcPr>
-            <w:tcW w:w="1100" w:type="dxa"/>
-            <w:tcBorders>
-              <w:top w:val="single" w:sz="4" w:space="0" w:color="8497B0"/>
-              <w:left w:val="single" w:sz="4" w:space="0" w:color="8497B0"/>
-              <w:bottom w:val="single" w:sz="4" w:space="0" w:color="8497B0"/>
-              <w:right w:val="single" w:sz="4" w:space="0" w:color="8497B0"/>
-            </w:tcBorders>
-            <w:tcMar>
-              <w:top w:w="60" w:type="dxa"/>
-              <w:left w:w="100" w:type="dxa"/>
-              <w:bottom w:w="60" w:type="dxa"/>
-              <w:right w:w="100" w:type="dxa"/>
-            </w:tcMar>
-          </w:tcPr>
-          <w:p>
-            <w:pPr>
-              <w:spacing w:after="40"/>
-            </w:pPr>
-            <w:r>
-              <w:rPr>
-                <w:sz w:val="16"/>
-                <w:szCs w:val="16"/>
-              </w:rPr>
-              <w:t>–</w:t>
-            </w:r>
-          </w:p>
-        </w:tc>
-        <w:tc>
-          <w:tcPr>
-            <w:tcW w:w="1300" w:type="dxa"/>
-            <w:tcBorders>
-              <w:top w:val="single" w:sz="4" w:space="0" w:color="8497B0"/>
-              <w:left w:val="single" w:sz="4" w:space="0" w:color="8497B0"/>
-              <w:bottom w:val="single" w:sz="4" w:space="0" w:color="8497B0"/>
-              <w:right w:val="single" w:sz="4" w:space="0" w:color="8497B0"/>
-            </w:tcBorders>
-            <w:tcMar>
-              <w:top w:w="60" w:type="dxa"/>
-              <w:left w:w="100" w:type="dxa"/>
-              <w:bottom w:w="60" w:type="dxa"/>
-              <w:right w:w="100" w:type="dxa"/>
-            </w:tcMar>
-          </w:tcPr>
-          <w:p>
-            <w:pPr>
-              <w:spacing w:after="40"/>
-            </w:pPr>
-            <w:r>
-              <w:rPr>
-                <w:sz w:val="16"/>
-                <w:szCs w:val="16"/>
-              </w:rPr>
-              <w:t>7.1</w:t>
-            </w:r>
-          </w:p>
-        </w:tc>
-        <w:tc>
-          <w:tcPr>
             <w:tcW w:w="1280" w:type="dxa"/>
             <w:tcBorders>
               <w:top w:val="single" w:sz="4" w:space="0" w:color="8497B0"/>
@@ -15278,7 +15798,7 @@
                 <w:sz w:val="16"/>
                 <w:szCs w:val="16"/>
               </w:rPr>
-              <w:t>7.1</w:t>
+              <w:t>8</w:t>
             </w:r>
           </w:p>
         </w:tc>
@@ -15302,18 +15822,24 @@
               <w:bottom w:val="single" w:sz="4" w:space="0" w:color="8497B0"/>
               <w:right w:val="single" w:sz="4" w:space="0" w:color="8497B0"/>
             </w:tcBorders>
-            <w:shd w:val="clear" w:color="auto" w:fill="EEF1F5"/>
-            <w:tcMar>
-              <w:top w:w="60" w:type="dxa"/>
-              <w:left w:w="100" w:type="dxa"/>
-              <w:bottom w:w="60" w:type="dxa"/>
-              <w:right w:w="100" w:type="dxa"/>
-            </w:tcMar>
-          </w:tcPr>
-          <w:p>
-            <w:pPr>
-              <w:spacing w:after="40"/>
-            </w:pPr>
+            <w:tcMar>
+              <w:top w:w="60" w:type="dxa"/>
+              <w:left w:w="100" w:type="dxa"/>
+              <w:bottom w:w="60" w:type="dxa"/>
+              <w:right w:w="100" w:type="dxa"/>
+            </w:tcMar>
+          </w:tcPr>
+          <w:p>
+            <w:pPr>
+              <w:spacing w:after="40"/>
+            </w:pPr>
+            <w:r>
+              <w:rPr>
+                <w:sz w:val="16"/>
+                <w:szCs w:val="16"/>
+              </w:rPr>
+              <w:t>11</w:t>
+            </w:r>
           </w:p>
         </w:tc>
         <w:tc>
@@ -15325,6 +15851,730 @@
               <w:bottom w:val="single" w:sz="4" w:space="0" w:color="8497B0"/>
               <w:right w:val="single" w:sz="4" w:space="0" w:color="8497B0"/>
             </w:tcBorders>
+            <w:tcMar>
+              <w:top w:w="60" w:type="dxa"/>
+              <w:left w:w="100" w:type="dxa"/>
+              <w:bottom w:w="60" w:type="dxa"/>
+              <w:right w:w="100" w:type="dxa"/>
+            </w:tcMar>
+          </w:tcPr>
+          <w:p>
+            <w:pPr>
+              <w:spacing w:after="40"/>
+            </w:pPr>
+            <w:r>
+              <w:rPr>
+                <w:sz w:val="16"/>
+                <w:szCs w:val="16"/>
+              </w:rPr>
+              <w:t>Workflow Studio – engine internal only (no public URL), router/loop/code steps, OAuth2 connections via portal callback †</w:t>
+            </w:r>
+          </w:p>
+        </w:tc>
+        <w:tc>
+          <w:tcPr>
+            <w:tcW w:w="1500" w:type="dxa"/>
+            <w:tcBorders>
+              <w:top w:val="single" w:sz="4" w:space="0" w:color="8497B0"/>
+              <w:left w:val="single" w:sz="4" w:space="0" w:color="8497B0"/>
+              <w:bottom w:val="single" w:sz="4" w:space="0" w:color="8497B0"/>
+              <w:right w:val="single" w:sz="4" w:space="0" w:color="8497B0"/>
+            </w:tcBorders>
+            <w:tcMar>
+              <w:top w:w="60" w:type="dxa"/>
+              <w:left w:w="100" w:type="dxa"/>
+              <w:bottom w:w="60" w:type="dxa"/>
+              <w:right w:w="100" w:type="dxa"/>
+            </w:tcMar>
+          </w:tcPr>
+          <w:p>
+            <w:pPr>
+              <w:spacing w:after="40"/>
+            </w:pPr>
+            <w:r>
+              <w:rPr>
+                <w:sz w:val="16"/>
+                <w:szCs w:val="16"/>
+              </w:rPr>
+              <w:t>AI Apps</w:t>
+            </w:r>
+          </w:p>
+        </w:tc>
+        <w:tc>
+          <w:tcPr>
+            <w:tcW w:w="1100" w:type="dxa"/>
+            <w:tcBorders>
+              <w:top w:val="single" w:sz="4" w:space="0" w:color="8497B0"/>
+              <w:left w:val="single" w:sz="4" w:space="0" w:color="8497B0"/>
+              <w:bottom w:val="single" w:sz="4" w:space="0" w:color="8497B0"/>
+              <w:right w:val="single" w:sz="4" w:space="0" w:color="8497B0"/>
+            </w:tcBorders>
+            <w:tcMar>
+              <w:top w:w="60" w:type="dxa"/>
+              <w:left w:w="100" w:type="dxa"/>
+              <w:bottom w:w="60" w:type="dxa"/>
+              <w:right w:w="100" w:type="dxa"/>
+            </w:tcMar>
+          </w:tcPr>
+          <w:p>
+            <w:pPr>
+              <w:spacing w:after="40"/>
+            </w:pPr>
+            <w:r>
+              <w:rPr>
+                <w:sz w:val="16"/>
+                <w:szCs w:val="16"/>
+              </w:rPr>
+              <w:t>1</w:t>
+            </w:r>
+          </w:p>
+        </w:tc>
+        <w:tc>
+          <w:tcPr>
+            <w:tcW w:w="1300" w:type="dxa"/>
+            <w:tcBorders>
+              <w:top w:val="single" w:sz="4" w:space="0" w:color="8497B0"/>
+              <w:left w:val="single" w:sz="4" w:space="0" w:color="8497B0"/>
+              <w:bottom w:val="single" w:sz="4" w:space="0" w:color="8497B0"/>
+              <w:right w:val="single" w:sz="4" w:space="0" w:color="8497B0"/>
+            </w:tcBorders>
+            <w:tcMar>
+              <w:top w:w="60" w:type="dxa"/>
+              <w:left w:w="100" w:type="dxa"/>
+              <w:bottom w:w="60" w:type="dxa"/>
+              <w:right w:w="100" w:type="dxa"/>
+            </w:tcMar>
+          </w:tcPr>
+          <w:p>
+            <w:pPr>
+              <w:spacing w:after="40"/>
+            </w:pPr>
+            <w:r>
+              <w:rPr>
+                <w:sz w:val="16"/>
+                <w:szCs w:val="16"/>
+              </w:rPr>
+              <w:t>5</w:t>
+            </w:r>
+          </w:p>
+        </w:tc>
+        <w:tc>
+          <w:tcPr>
+            <w:tcW w:w="1100" w:type="dxa"/>
+            <w:tcBorders>
+              <w:top w:val="single" w:sz="4" w:space="0" w:color="8497B0"/>
+              <w:left w:val="single" w:sz="4" w:space="0" w:color="8497B0"/>
+              <w:bottom w:val="single" w:sz="4" w:space="0" w:color="8497B0"/>
+              <w:right w:val="single" w:sz="4" w:space="0" w:color="8497B0"/>
+            </w:tcBorders>
+            <w:tcMar>
+              <w:top w:w="60" w:type="dxa"/>
+              <w:left w:w="100" w:type="dxa"/>
+              <w:bottom w:w="60" w:type="dxa"/>
+              <w:right w:w="100" w:type="dxa"/>
+            </w:tcMar>
+          </w:tcPr>
+          <w:p>
+            <w:pPr>
+              <w:spacing w:after="40"/>
+            </w:pPr>
+            <w:r>
+              <w:rPr>
+                <w:sz w:val="16"/>
+                <w:szCs w:val="16"/>
+              </w:rPr>
+              <w:t>3</w:t>
+            </w:r>
+          </w:p>
+        </w:tc>
+        <w:tc>
+          <w:tcPr>
+            <w:tcW w:w="1300" w:type="dxa"/>
+            <w:tcBorders>
+              <w:top w:val="single" w:sz="4" w:space="0" w:color="8497B0"/>
+              <w:left w:val="single" w:sz="4" w:space="0" w:color="8497B0"/>
+              <w:bottom w:val="single" w:sz="4" w:space="0" w:color="8497B0"/>
+              <w:right w:val="single" w:sz="4" w:space="0" w:color="8497B0"/>
+            </w:tcBorders>
+            <w:tcMar>
+              <w:top w:w="60" w:type="dxa"/>
+              <w:left w:w="100" w:type="dxa"/>
+              <w:bottom w:w="60" w:type="dxa"/>
+              <w:right w:w="100" w:type="dxa"/>
+            </w:tcMar>
+          </w:tcPr>
+          <w:p>
+            <w:pPr>
+              <w:spacing w:after="40"/>
+            </w:pPr>
+            <w:r>
+              <w:rPr>
+                <w:sz w:val="16"/>
+                <w:szCs w:val="16"/>
+              </w:rPr>
+              <w:t>–</w:t>
+            </w:r>
+          </w:p>
+        </w:tc>
+        <w:tc>
+          <w:tcPr>
+            <w:tcW w:w="1280" w:type="dxa"/>
+            <w:tcBorders>
+              <w:top w:val="single" w:sz="4" w:space="0" w:color="8497B0"/>
+              <w:left w:val="single" w:sz="4" w:space="0" w:color="8497B0"/>
+              <w:bottom w:val="single" w:sz="4" w:space="0" w:color="8497B0"/>
+              <w:right w:val="single" w:sz="4" w:space="0" w:color="8497B0"/>
+            </w:tcBorders>
+            <w:tcMar>
+              <w:top w:w="60" w:type="dxa"/>
+              <w:left w:w="100" w:type="dxa"/>
+              <w:bottom w:w="60" w:type="dxa"/>
+              <w:right w:w="100" w:type="dxa"/>
+            </w:tcMar>
+          </w:tcPr>
+          <w:p>
+            <w:pPr>
+              <w:spacing w:after="40"/>
+            </w:pPr>
+            <w:r>
+              <w:rPr>
+                <w:sz w:val="16"/>
+                <w:szCs w:val="16"/>
+              </w:rPr>
+              <w:t>9</w:t>
+            </w:r>
+          </w:p>
+        </w:tc>
+      </w:tr>
+      <w:tr>
+        <w:tblPrEx>
+          <w:tblCellMar>
+            <w:top w:w="0" w:type="dxa"/>
+            <w:bottom w:w="0" w:type="dxa"/>
+          </w:tblCellMar>
+        </w:tblPrEx>
+        <w:trPr>
+          <w:cantSplit/>
+        </w:trPr>
+        <w:tc>
+          <w:tcPr>
+            <w:tcW w:w="500" w:type="dxa"/>
+            <w:tcBorders>
+              <w:top w:val="single" w:sz="4" w:space="0" w:color="8497B0"/>
+              <w:left w:val="single" w:sz="4" w:space="0" w:color="8497B0"/>
+              <w:bottom w:val="single" w:sz="4" w:space="0" w:color="8497B0"/>
+              <w:right w:val="single" w:sz="4" w:space="0" w:color="8497B0"/>
+            </w:tcBorders>
+            <w:shd w:val="clear" w:color="auto" w:fill="EEF1F5"/>
+            <w:tcMar>
+              <w:top w:w="60" w:type="dxa"/>
+              <w:left w:w="100" w:type="dxa"/>
+              <w:bottom w:w="60" w:type="dxa"/>
+              <w:right w:w="100" w:type="dxa"/>
+            </w:tcMar>
+          </w:tcPr>
+          <w:p>
+            <w:pPr>
+              <w:spacing w:after="40"/>
+            </w:pPr>
+            <w:r>
+              <w:rPr>
+                <w:sz w:val="16"/>
+                <w:szCs w:val="16"/>
+              </w:rPr>
+              <w:t>12</w:t>
+            </w:r>
+          </w:p>
+        </w:tc>
+        <w:tc>
+          <w:tcPr>
+            <w:tcW w:w="5600" w:type="dxa"/>
+            <w:tcBorders>
+              <w:top w:val="single" w:sz="4" w:space="0" w:color="8497B0"/>
+              <w:left w:val="single" w:sz="4" w:space="0" w:color="8497B0"/>
+              <w:bottom w:val="single" w:sz="4" w:space="0" w:color="8497B0"/>
+              <w:right w:val="single" w:sz="4" w:space="0" w:color="8497B0"/>
+            </w:tcBorders>
+            <w:shd w:val="clear" w:color="auto" w:fill="EEF1F5"/>
+            <w:tcMar>
+              <w:top w:w="60" w:type="dxa"/>
+              <w:left w:w="100" w:type="dxa"/>
+              <w:bottom w:w="60" w:type="dxa"/>
+              <w:right w:w="100" w:type="dxa"/>
+            </w:tcMar>
+          </w:tcPr>
+          <w:p>
+            <w:pPr>
+              <w:spacing w:after="40"/>
+            </w:pPr>
+            <w:r>
+              <w:rPr>
+                <w:sz w:val="16"/>
+                <w:szCs w:val="16"/>
+              </w:rPr>
+              <w:t>Continuous architecture, design, testing</w:t>
+            </w:r>
+          </w:p>
+        </w:tc>
+        <w:tc>
+          <w:tcPr>
+            <w:tcW w:w="1500" w:type="dxa"/>
+            <w:tcBorders>
+              <w:top w:val="single" w:sz="4" w:space="0" w:color="8497B0"/>
+              <w:left w:val="single" w:sz="4" w:space="0" w:color="8497B0"/>
+              <w:bottom w:val="single" w:sz="4" w:space="0" w:color="8497B0"/>
+              <w:right w:val="single" w:sz="4" w:space="0" w:color="8497B0"/>
+            </w:tcBorders>
+            <w:shd w:val="clear" w:color="auto" w:fill="EEF1F5"/>
+            <w:tcMar>
+              <w:top w:w="60" w:type="dxa"/>
+              <w:left w:w="100" w:type="dxa"/>
+              <w:bottom w:w="60" w:type="dxa"/>
+              <w:right w:w="100" w:type="dxa"/>
+            </w:tcMar>
+          </w:tcPr>
+          <w:p>
+            <w:pPr>
+              <w:spacing w:after="40"/>
+            </w:pPr>
+            <w:r>
+              <w:rPr>
+                <w:sz w:val="16"/>
+                <w:szCs w:val="16"/>
+              </w:rPr>
+              <w:t>Shared (continuous)</w:t>
+            </w:r>
+          </w:p>
+        </w:tc>
+        <w:tc>
+          <w:tcPr>
+            <w:tcW w:w="1100" w:type="dxa"/>
+            <w:tcBorders>
+              <w:top w:val="single" w:sz="4" w:space="0" w:color="8497B0"/>
+              <w:left w:val="single" w:sz="4" w:space="0" w:color="8497B0"/>
+              <w:bottom w:val="single" w:sz="4" w:space="0" w:color="8497B0"/>
+              <w:right w:val="single" w:sz="4" w:space="0" w:color="8497B0"/>
+            </w:tcBorders>
+            <w:shd w:val="clear" w:color="auto" w:fill="EEF1F5"/>
+            <w:tcMar>
+              <w:top w:w="60" w:type="dxa"/>
+              <w:left w:w="100" w:type="dxa"/>
+              <w:bottom w:w="60" w:type="dxa"/>
+              <w:right w:w="100" w:type="dxa"/>
+            </w:tcMar>
+          </w:tcPr>
+          <w:p>
+            <w:pPr>
+              <w:spacing w:after="40"/>
+            </w:pPr>
+            <w:r>
+              <w:rPr>
+                <w:sz w:val="16"/>
+                <w:szCs w:val="16"/>
+              </w:rPr>
+              <w:t>3</w:t>
+            </w:r>
+          </w:p>
+        </w:tc>
+        <w:tc>
+          <w:tcPr>
+            <w:tcW w:w="1300" w:type="dxa"/>
+            <w:tcBorders>
+              <w:top w:val="single" w:sz="4" w:space="0" w:color="8497B0"/>
+              <w:left w:val="single" w:sz="4" w:space="0" w:color="8497B0"/>
+              <w:bottom w:val="single" w:sz="4" w:space="0" w:color="8497B0"/>
+              <w:right w:val="single" w:sz="4" w:space="0" w:color="8497B0"/>
+            </w:tcBorders>
+            <w:shd w:val="clear" w:color="auto" w:fill="EEF1F5"/>
+            <w:tcMar>
+              <w:top w:w="60" w:type="dxa"/>
+              <w:left w:w="100" w:type="dxa"/>
+              <w:bottom w:w="60" w:type="dxa"/>
+              <w:right w:w="100" w:type="dxa"/>
+            </w:tcMar>
+          </w:tcPr>
+          <w:p>
+            <w:pPr>
+              <w:spacing w:after="40"/>
+            </w:pPr>
+            <w:r>
+              <w:rPr>
+                <w:sz w:val="16"/>
+                <w:szCs w:val="16"/>
+              </w:rPr>
+              <w:t>2</w:t>
+            </w:r>
+          </w:p>
+        </w:tc>
+        <w:tc>
+          <w:tcPr>
+            <w:tcW w:w="1100" w:type="dxa"/>
+            <w:tcBorders>
+              <w:top w:val="single" w:sz="4" w:space="0" w:color="8497B0"/>
+              <w:left w:val="single" w:sz="4" w:space="0" w:color="8497B0"/>
+              <w:bottom w:val="single" w:sz="4" w:space="0" w:color="8497B0"/>
+              <w:right w:val="single" w:sz="4" w:space="0" w:color="8497B0"/>
+            </w:tcBorders>
+            <w:shd w:val="clear" w:color="auto" w:fill="EEF1F5"/>
+            <w:tcMar>
+              <w:top w:w="60" w:type="dxa"/>
+              <w:left w:w="100" w:type="dxa"/>
+              <w:bottom w:w="60" w:type="dxa"/>
+              <w:right w:w="100" w:type="dxa"/>
+            </w:tcMar>
+          </w:tcPr>
+          <w:p>
+            <w:pPr>
+              <w:spacing w:after="40"/>
+            </w:pPr>
+            <w:r>
+              <w:rPr>
+                <w:sz w:val="16"/>
+                <w:szCs w:val="16"/>
+              </w:rPr>
+              <w:t>4</w:t>
+            </w:r>
+          </w:p>
+        </w:tc>
+        <w:tc>
+          <w:tcPr>
+            <w:tcW w:w="1300" w:type="dxa"/>
+            <w:tcBorders>
+              <w:top w:val="single" w:sz="4" w:space="0" w:color="8497B0"/>
+              <w:left w:val="single" w:sz="4" w:space="0" w:color="8497B0"/>
+              <w:bottom w:val="single" w:sz="4" w:space="0" w:color="8497B0"/>
+              <w:right w:val="single" w:sz="4" w:space="0" w:color="8497B0"/>
+            </w:tcBorders>
+            <w:shd w:val="clear" w:color="auto" w:fill="EEF1F5"/>
+            <w:tcMar>
+              <w:top w:w="60" w:type="dxa"/>
+              <w:left w:w="100" w:type="dxa"/>
+              <w:bottom w:w="60" w:type="dxa"/>
+              <w:right w:w="100" w:type="dxa"/>
+            </w:tcMar>
+          </w:tcPr>
+          <w:p>
+            <w:pPr>
+              <w:spacing w:after="40"/>
+            </w:pPr>
+            <w:r>
+              <w:rPr>
+                <w:sz w:val="16"/>
+                <w:szCs w:val="16"/>
+              </w:rPr>
+              <w:t>–</w:t>
+            </w:r>
+          </w:p>
+        </w:tc>
+        <w:tc>
+          <w:tcPr>
+            <w:tcW w:w="1280" w:type="dxa"/>
+            <w:tcBorders>
+              <w:top w:val="single" w:sz="4" w:space="0" w:color="8497B0"/>
+              <w:left w:val="single" w:sz="4" w:space="0" w:color="8497B0"/>
+              <w:bottom w:val="single" w:sz="4" w:space="0" w:color="8497B0"/>
+              <w:right w:val="single" w:sz="4" w:space="0" w:color="8497B0"/>
+            </w:tcBorders>
+            <w:shd w:val="clear" w:color="auto" w:fill="EEF1F5"/>
+            <w:tcMar>
+              <w:top w:w="60" w:type="dxa"/>
+              <w:left w:w="100" w:type="dxa"/>
+              <w:bottom w:w="60" w:type="dxa"/>
+              <w:right w:w="100" w:type="dxa"/>
+            </w:tcMar>
+          </w:tcPr>
+          <w:p>
+            <w:pPr>
+              <w:spacing w:after="40"/>
+            </w:pPr>
+            <w:r>
+              <w:rPr>
+                <w:sz w:val="16"/>
+                <w:szCs w:val="16"/>
+              </w:rPr>
+              <w:t>9</w:t>
+            </w:r>
+          </w:p>
+        </w:tc>
+      </w:tr>
+      <w:tr>
+        <w:tblPrEx>
+          <w:tblCellMar>
+            <w:top w:w="0" w:type="dxa"/>
+            <w:bottom w:w="0" w:type="dxa"/>
+          </w:tblCellMar>
+        </w:tblPrEx>
+        <w:trPr>
+          <w:cantSplit/>
+        </w:trPr>
+        <w:tc>
+          <w:tcPr>
+            <w:tcW w:w="500" w:type="dxa"/>
+            <w:tcBorders>
+              <w:top w:val="single" w:sz="4" w:space="0" w:color="8497B0"/>
+              <w:left w:val="single" w:sz="4" w:space="0" w:color="8497B0"/>
+              <w:bottom w:val="single" w:sz="4" w:space="0" w:color="8497B0"/>
+              <w:right w:val="single" w:sz="4" w:space="0" w:color="8497B0"/>
+            </w:tcBorders>
+            <w:tcMar>
+              <w:top w:w="60" w:type="dxa"/>
+              <w:left w:w="100" w:type="dxa"/>
+              <w:bottom w:w="60" w:type="dxa"/>
+              <w:right w:w="100" w:type="dxa"/>
+            </w:tcMar>
+          </w:tcPr>
+          <w:p>
+            <w:pPr>
+              <w:spacing w:after="40"/>
+            </w:pPr>
+          </w:p>
+        </w:tc>
+        <w:tc>
+          <w:tcPr>
+            <w:tcW w:w="5600" w:type="dxa"/>
+            <w:tcBorders>
+              <w:top w:val="single" w:sz="4" w:space="0" w:color="8497B0"/>
+              <w:left w:val="single" w:sz="4" w:space="0" w:color="8497B0"/>
+              <w:bottom w:val="single" w:sz="4" w:space="0" w:color="8497B0"/>
+              <w:right w:val="single" w:sz="4" w:space="0" w:color="8497B0"/>
+            </w:tcBorders>
+            <w:tcMar>
+              <w:top w:w="60" w:type="dxa"/>
+              <w:left w:w="100" w:type="dxa"/>
+              <w:bottom w:w="60" w:type="dxa"/>
+              <w:right w:w="100" w:type="dxa"/>
+            </w:tcMar>
+          </w:tcPr>
+          <w:p>
+            <w:pPr>
+              <w:spacing w:after="40"/>
+            </w:pPr>
+            <w:r>
+              <w:rPr>
+                <w:sz w:val="16"/>
+                <w:szCs w:val="16"/>
+              </w:rPr>
+              <w:t>Product management (10% of phase effort)</w:t>
+            </w:r>
+          </w:p>
+        </w:tc>
+        <w:tc>
+          <w:tcPr>
+            <w:tcW w:w="1500" w:type="dxa"/>
+            <w:tcBorders>
+              <w:top w:val="single" w:sz="4" w:space="0" w:color="8497B0"/>
+              <w:left w:val="single" w:sz="4" w:space="0" w:color="8497B0"/>
+              <w:bottom w:val="single" w:sz="4" w:space="0" w:color="8497B0"/>
+              <w:right w:val="single" w:sz="4" w:space="0" w:color="8497B0"/>
+            </w:tcBorders>
+            <w:tcMar>
+              <w:top w:w="60" w:type="dxa"/>
+              <w:left w:w="100" w:type="dxa"/>
+              <w:bottom w:w="60" w:type="dxa"/>
+              <w:right w:w="100" w:type="dxa"/>
+            </w:tcMar>
+          </w:tcPr>
+          <w:p>
+            <w:pPr>
+              <w:spacing w:after="40"/>
+            </w:pPr>
+            <w:r>
+              <w:rPr>
+                <w:sz w:val="16"/>
+                <w:szCs w:val="16"/>
+              </w:rPr>
+              <w:t>Programme</w:t>
+            </w:r>
+          </w:p>
+        </w:tc>
+        <w:tc>
+          <w:tcPr>
+            <w:tcW w:w="1100" w:type="dxa"/>
+            <w:tcBorders>
+              <w:top w:val="single" w:sz="4" w:space="0" w:color="8497B0"/>
+              <w:left w:val="single" w:sz="4" w:space="0" w:color="8497B0"/>
+              <w:bottom w:val="single" w:sz="4" w:space="0" w:color="8497B0"/>
+              <w:right w:val="single" w:sz="4" w:space="0" w:color="8497B0"/>
+            </w:tcBorders>
+            <w:tcMar>
+              <w:top w:w="60" w:type="dxa"/>
+              <w:left w:w="100" w:type="dxa"/>
+              <w:bottom w:w="60" w:type="dxa"/>
+              <w:right w:w="100" w:type="dxa"/>
+            </w:tcMar>
+          </w:tcPr>
+          <w:p>
+            <w:pPr>
+              <w:spacing w:after="40"/>
+            </w:pPr>
+            <w:r>
+              <w:rPr>
+                <w:sz w:val="16"/>
+                <w:szCs w:val="16"/>
+              </w:rPr>
+              <w:t>–</w:t>
+            </w:r>
+          </w:p>
+        </w:tc>
+        <w:tc>
+          <w:tcPr>
+            <w:tcW w:w="1300" w:type="dxa"/>
+            <w:tcBorders>
+              <w:top w:val="single" w:sz="4" w:space="0" w:color="8497B0"/>
+              <w:left w:val="single" w:sz="4" w:space="0" w:color="8497B0"/>
+              <w:bottom w:val="single" w:sz="4" w:space="0" w:color="8497B0"/>
+              <w:right w:val="single" w:sz="4" w:space="0" w:color="8497B0"/>
+            </w:tcBorders>
+            <w:tcMar>
+              <w:top w:w="60" w:type="dxa"/>
+              <w:left w:w="100" w:type="dxa"/>
+              <w:bottom w:w="60" w:type="dxa"/>
+              <w:right w:w="100" w:type="dxa"/>
+            </w:tcMar>
+          </w:tcPr>
+          <w:p>
+            <w:pPr>
+              <w:spacing w:after="40"/>
+            </w:pPr>
+            <w:r>
+              <w:rPr>
+                <w:sz w:val="16"/>
+                <w:szCs w:val="16"/>
+              </w:rPr>
+              <w:t>–</w:t>
+            </w:r>
+          </w:p>
+        </w:tc>
+        <w:tc>
+          <w:tcPr>
+            <w:tcW w:w="1100" w:type="dxa"/>
+            <w:tcBorders>
+              <w:top w:val="single" w:sz="4" w:space="0" w:color="8497B0"/>
+              <w:left w:val="single" w:sz="4" w:space="0" w:color="8497B0"/>
+              <w:bottom w:val="single" w:sz="4" w:space="0" w:color="8497B0"/>
+              <w:right w:val="single" w:sz="4" w:space="0" w:color="8497B0"/>
+            </w:tcBorders>
+            <w:tcMar>
+              <w:top w:w="60" w:type="dxa"/>
+              <w:left w:w="100" w:type="dxa"/>
+              <w:bottom w:w="60" w:type="dxa"/>
+              <w:right w:w="100" w:type="dxa"/>
+            </w:tcMar>
+          </w:tcPr>
+          <w:p>
+            <w:pPr>
+              <w:spacing w:after="40"/>
+            </w:pPr>
+            <w:r>
+              <w:rPr>
+                <w:sz w:val="16"/>
+                <w:szCs w:val="16"/>
+              </w:rPr>
+              <w:t>–</w:t>
+            </w:r>
+          </w:p>
+        </w:tc>
+        <w:tc>
+          <w:tcPr>
+            <w:tcW w:w="1300" w:type="dxa"/>
+            <w:tcBorders>
+              <w:top w:val="single" w:sz="4" w:space="0" w:color="8497B0"/>
+              <w:left w:val="single" w:sz="4" w:space="0" w:color="8497B0"/>
+              <w:bottom w:val="single" w:sz="4" w:space="0" w:color="8497B0"/>
+              <w:right w:val="single" w:sz="4" w:space="0" w:color="8497B0"/>
+            </w:tcBorders>
+            <w:tcMar>
+              <w:top w:w="60" w:type="dxa"/>
+              <w:left w:w="100" w:type="dxa"/>
+              <w:bottom w:w="60" w:type="dxa"/>
+              <w:right w:w="100" w:type="dxa"/>
+            </w:tcMar>
+          </w:tcPr>
+          <w:p>
+            <w:pPr>
+              <w:spacing w:after="40"/>
+            </w:pPr>
+            <w:r>
+              <w:rPr>
+                <w:sz w:val="16"/>
+                <w:szCs w:val="16"/>
+              </w:rPr>
+              <w:t>10.2</w:t>
+            </w:r>
+          </w:p>
+        </w:tc>
+        <w:tc>
+          <w:tcPr>
+            <w:tcW w:w="1280" w:type="dxa"/>
+            <w:tcBorders>
+              <w:top w:val="single" w:sz="4" w:space="0" w:color="8497B0"/>
+              <w:left w:val="single" w:sz="4" w:space="0" w:color="8497B0"/>
+              <w:bottom w:val="single" w:sz="4" w:space="0" w:color="8497B0"/>
+              <w:right w:val="single" w:sz="4" w:space="0" w:color="8497B0"/>
+            </w:tcBorders>
+            <w:tcMar>
+              <w:top w:w="60" w:type="dxa"/>
+              <w:left w:w="100" w:type="dxa"/>
+              <w:bottom w:w="60" w:type="dxa"/>
+              <w:right w:w="100" w:type="dxa"/>
+            </w:tcMar>
+          </w:tcPr>
+          <w:p>
+            <w:pPr>
+              <w:spacing w:after="40"/>
+            </w:pPr>
+            <w:r>
+              <w:rPr>
+                <w:sz w:val="16"/>
+                <w:szCs w:val="16"/>
+              </w:rPr>
+              <w:t>10.2</w:t>
+            </w:r>
+          </w:p>
+        </w:tc>
+      </w:tr>
+      <w:tr>
+        <w:tblPrEx>
+          <w:tblCellMar>
+            <w:top w:w="0" w:type="dxa"/>
+            <w:bottom w:w="0" w:type="dxa"/>
+          </w:tblCellMar>
+        </w:tblPrEx>
+        <w:trPr>
+          <w:cantSplit/>
+        </w:trPr>
+        <w:tc>
+          <w:tcPr>
+            <w:tcW w:w="500" w:type="dxa"/>
+            <w:tcBorders>
+              <w:top w:val="single" w:sz="4" w:space="0" w:color="8497B0"/>
+              <w:left w:val="single" w:sz="4" w:space="0" w:color="8497B0"/>
+              <w:bottom w:val="single" w:sz="4" w:space="0" w:color="8497B0"/>
+              <w:right w:val="single" w:sz="4" w:space="0" w:color="8497B0"/>
+            </w:tcBorders>
+            <w:shd w:val="clear" w:color="auto" w:fill="EEF1F5"/>
+            <w:tcMar>
+              <w:top w:w="60" w:type="dxa"/>
+              <w:left w:w="100" w:type="dxa"/>
+              <w:bottom w:w="60" w:type="dxa"/>
+              <w:right w:w="100" w:type="dxa"/>
+            </w:tcMar>
+          </w:tcPr>
+          <w:p>
+            <w:pPr>
+              <w:spacing w:after="40"/>
+            </w:pPr>
+          </w:p>
+        </w:tc>
+        <w:tc>
+          <w:tcPr>
+            <w:tcW w:w="5600" w:type="dxa"/>
+            <w:tcBorders>
+              <w:top w:val="single" w:sz="4" w:space="0" w:color="8497B0"/>
+              <w:left w:val="single" w:sz="4" w:space="0" w:color="8497B0"/>
+              <w:bottom w:val="single" w:sz="4" w:space="0" w:color="8497B0"/>
+              <w:right w:val="single" w:sz="4" w:space="0" w:color="8497B0"/>
+            </w:tcBorders>
             <w:shd w:val="clear" w:color="auto" w:fill="EEF1F5"/>
             <w:tcMar>
               <w:top w:w="60" w:type="dxa"/>
@@ -15395,7 +16645,7 @@
                 <w:sz w:val="16"/>
                 <w:szCs w:val="16"/>
               </w:rPr>
-              <w:t>5</w:t>
+              <w:t>10</w:t>
             </w:r>
           </w:p>
         </w:tc>
@@ -15425,7 +16675,7 @@
                 <w:sz w:val="16"/>
                 <w:szCs w:val="16"/>
               </w:rPr>
-              <w:t>44.5</w:t>
+              <w:t>62.5</w:t>
             </w:r>
           </w:p>
         </w:tc>
@@ -15455,7 +16705,7 @@
                 <w:sz w:val="16"/>
                 <w:szCs w:val="16"/>
               </w:rPr>
-              <w:t>21</w:t>
+              <w:t>29</w:t>
             </w:r>
           </w:p>
         </w:tc>
@@ -15485,7 +16735,7 @@
                 <w:sz w:val="16"/>
                 <w:szCs w:val="16"/>
               </w:rPr>
-              <w:t>7.1</w:t>
+              <w:t>10.2</w:t>
             </w:r>
           </w:p>
         </w:tc>
@@ -15515,7 +16765,7 @@
                 <w:sz w:val="16"/>
                 <w:szCs w:val="16"/>
               </w:rPr>
-              <w:t>77.6</w:t>
+              <w:t>111.7</w:t>
             </w:r>
           </w:p>
         </w:tc>
@@ -22341,7 +23591,7 @@
                 <w:sz w:val="16"/>
                 <w:szCs w:val="16"/>
               </w:rPr>
-              <w:t>5</w:t>
+              <w:t>10</w:t>
             </w:r>
           </w:p>
         </w:tc>
@@ -22428,7 +23678,7 @@
                 <w:sz w:val="16"/>
                 <w:szCs w:val="16"/>
               </w:rPr>
-              <w:t>31.7</w:t>
+              <w:t>36.7</w:t>
             </w:r>
           </w:p>
         </w:tc>
@@ -22561,7 +23811,7 @@
                 <w:sz w:val="16"/>
                 <w:szCs w:val="16"/>
               </w:rPr>
-              <w:t>44.5</w:t>
+              <w:t>62.5</w:t>
             </w:r>
           </w:p>
         </w:tc>
@@ -22651,7 +23901,7 @@
                 <w:sz w:val="16"/>
                 <w:szCs w:val="16"/>
               </w:rPr>
-              <w:t>182.5</w:t>
+              <w:t>200.5</w:t>
             </w:r>
           </w:p>
         </w:tc>
@@ -22780,7 +24030,7 @@
                 <w:sz w:val="16"/>
                 <w:szCs w:val="16"/>
               </w:rPr>
-              <w:t>21</w:t>
+              <w:t>29</w:t>
             </w:r>
           </w:p>
         </w:tc>
@@ -22867,7 +24117,7 @@
                 <w:sz w:val="16"/>
                 <w:szCs w:val="16"/>
               </w:rPr>
-              <w:t>78.3</w:t>
+              <w:t>86.3</w:t>
             </w:r>
           </w:p>
         </w:tc>
@@ -23000,7 +24250,7 @@
                 <w:sz w:val="16"/>
                 <w:szCs w:val="16"/>
               </w:rPr>
-              <w:t>7.1</w:t>
+              <w:t>10.2</w:t>
             </w:r>
           </w:p>
         </w:tc>
@@ -23090,7 +24340,7 @@
                 <w:sz w:val="16"/>
                 <w:szCs w:val="16"/>
               </w:rPr>
-              <w:t>29.3</w:t>
+              <w:t>32.4</w:t>
             </w:r>
           </w:p>
         </w:tc>
@@ -23219,7 +24469,7 @@
                 <w:sz w:val="16"/>
                 <w:szCs w:val="16"/>
               </w:rPr>
-              <w:t>77.6</w:t>
+              <w:t>111.7</w:t>
             </w:r>
           </w:p>
         </w:tc>
@@ -23306,7 +24556,7 @@
                 <w:sz w:val="16"/>
                 <w:szCs w:val="16"/>
               </w:rPr>
-              <w:t>321.8</w:t>
+              <w:t>355.9</w:t>
             </w:r>
           </w:p>
         </w:tc>
@@ -23439,7 +24689,7 @@
                 <w:sz w:val="16"/>
                 <w:szCs w:val="16"/>
               </w:rPr>
-              <w:t>3.9</w:t>
+              <w:t>5.6</w:t>
             </w:r>
           </w:p>
         </w:tc>
@@ -23529,7 +24779,7 @@
                 <w:sz w:val="16"/>
                 <w:szCs w:val="16"/>
               </w:rPr>
-              <w:t>3.2</w:t>
+              <w:t>3.6</w:t>
             </w:r>
           </w:p>
         </w:tc>
@@ -24149,7 +25399,7 @@
                 <w:sz w:val="16"/>
                 <w:szCs w:val="16"/>
               </w:rPr>
-              <w:t>39.6</w:t>
+              <w:t>73.7</w:t>
             </w:r>
           </w:p>
         </w:tc>
@@ -24239,7 +25489,7 @@
                 <w:sz w:val="16"/>
                 <w:szCs w:val="16"/>
               </w:rPr>
-              <w:t>146.3</w:t>
+              <w:t>180.4</w:t>
             </w:r>
           </w:p>
         </w:tc>
@@ -24368,7 +25618,7 @@
                 <w:sz w:val="16"/>
                 <w:szCs w:val="16"/>
               </w:rPr>
-              <w:t>77.6</w:t>
+              <w:t>111.7</w:t>
             </w:r>
           </w:p>
         </w:tc>
@@ -24455,7 +25705,7 @@
                 <w:sz w:val="16"/>
                 <w:szCs w:val="16"/>
               </w:rPr>
-              <w:t>321.8</w:t>
+              <w:t>355.9</w:t>
             </w:r>
           </w:p>
         </w:tc>
@@ -26444,7 +27694,7 @@
                 <w:sz w:val="16"/>
                 <w:szCs w:val="16"/>
               </w:rPr>
-              <w:t>2</w:t>
+              <w:t>7</w:t>
             </w:r>
           </w:p>
         </w:tc>
@@ -26531,7 +27781,7 @@
                 <w:sz w:val="16"/>
                 <w:szCs w:val="16"/>
               </w:rPr>
-              <w:t>16.3</w:t>
+              <w:t>21.3</w:t>
             </w:r>
           </w:p>
         </w:tc>
@@ -26664,7 +27914,7 @@
                 <w:sz w:val="16"/>
                 <w:szCs w:val="16"/>
               </w:rPr>
-              <w:t>21.8</w:t>
+              <w:t>39.8</w:t>
             </w:r>
           </w:p>
         </w:tc>
@@ -26754,7 +28004,7 @@
                 <w:sz w:val="16"/>
                 <w:szCs w:val="16"/>
               </w:rPr>
-              <w:t>81.2</w:t>
+              <w:t>99.2</w:t>
             </w:r>
           </w:p>
         </w:tc>
@@ -26883,7 +28133,7 @@
                 <w:sz w:val="16"/>
                 <w:szCs w:val="16"/>
               </w:rPr>
-              <w:t>12.2</w:t>
+              <w:t>20.2</w:t>
             </w:r>
           </w:p>
         </w:tc>
@@ -26970,7 +28220,7 @@
                 <w:sz w:val="16"/>
                 <w:szCs w:val="16"/>
               </w:rPr>
-              <w:t>35.5</w:t>
+              <w:t>43.5</w:t>
             </w:r>
           </w:p>
         </w:tc>
@@ -27103,7 +28353,7 @@
                 <w:sz w:val="16"/>
                 <w:szCs w:val="16"/>
               </w:rPr>
-              <w:t>3.6</w:t>
+              <w:t>6.7</w:t>
             </w:r>
           </w:p>
         </w:tc>
@@ -27193,7 +28443,7 @@
                 <w:sz w:val="16"/>
                 <w:szCs w:val="16"/>
               </w:rPr>
-              <w:t>13.3</w:t>
+              <w:t>16.4</w:t>
             </w:r>
           </w:p>
         </w:tc>
@@ -27322,7 +28572,7 @@
                 <w:sz w:val="16"/>
                 <w:szCs w:val="16"/>
               </w:rPr>
-              <w:t>39.6</w:t>
+              <w:t>73.7</w:t>
             </w:r>
           </w:p>
         </w:tc>
@@ -27409,7 +28659,7 @@
                 <w:sz w:val="16"/>
                 <w:szCs w:val="16"/>
               </w:rPr>
-              <w:t>146.3</w:t>
+              <w:t>180.4</w:t>
             </w:r>
           </w:p>
         </w:tc>
@@ -27542,7 +28792,7 @@
                 <w:sz w:val="16"/>
                 <w:szCs w:val="16"/>
               </w:rPr>
-              <w:t>2</w:t>
+              <w:t>3.7</w:t>
             </w:r>
           </w:p>
         </w:tc>
@@ -27632,7 +28882,7 @@
                 <w:sz w:val="16"/>
                 <w:szCs w:val="16"/>
               </w:rPr>
-              <w:t>1.5</w:t>
+              <w:t>1.8</w:t>
             </w:r>
           </w:p>
         </w:tc>
@@ -28040,7 +29290,7 @@
                 <w:sz w:val="16"/>
                 <w:szCs w:val="16"/>
               </w:rPr>
-              <w:t>0.3</w:t>
+              <w:t>0.5</w:t>
             </w:r>
           </w:p>
         </w:tc>
@@ -28127,7 +29377,7 @@
                 <w:sz w:val="16"/>
                 <w:szCs w:val="16"/>
               </w:rPr>
-              <w:t>0.3</w:t>
+              <w:t>0.4</w:t>
             </w:r>
           </w:p>
         </w:tc>
@@ -28260,7 +29510,7 @@
                 <w:sz w:val="16"/>
                 <w:szCs w:val="16"/>
               </w:rPr>
-              <w:t>2.2</w:t>
+              <w:t>3.1</w:t>
             </w:r>
           </w:p>
         </w:tc>
@@ -28350,7 +29600,7 @@
                 <w:sz w:val="16"/>
                 <w:szCs w:val="16"/>
               </w:rPr>
-              <w:t>1.8</w:t>
+              <w:t>2</w:t>
             </w:r>
           </w:p>
         </w:tc>
@@ -28479,7 +29729,7 @@
                 <w:sz w:val="16"/>
                 <w:szCs w:val="16"/>
               </w:rPr>
-              <w:t>1.1</w:t>
+              <w:t>1.5</w:t>
             </w:r>
           </w:p>
         </w:tc>
@@ -28566,7 +29816,7 @@
                 <w:sz w:val="16"/>
                 <w:szCs w:val="16"/>
               </w:rPr>
-              <w:t>0.8</w:t>
+              <w:t>0.9</w:t>
             </w:r>
           </w:p>
         </w:tc>
@@ -28699,7 +29949,7 @@
                 <w:sz w:val="16"/>
                 <w:szCs w:val="16"/>
               </w:rPr>
-              <w:t>0.4</w:t>
+              <w:t>0.5</w:t>
             </w:r>
           </w:p>
         </w:tc>
@@ -28918,7 +30168,7 @@
                 <w:sz w:val="16"/>
                 <w:szCs w:val="16"/>
               </w:rPr>
-              <w:t>3.9</w:t>
+              <w:t>5.6</w:t>
             </w:r>
           </w:p>
         </w:tc>
@@ -29005,7 +30255,7 @@
                 <w:sz w:val="16"/>
                 <w:szCs w:val="16"/>
               </w:rPr>
-              <w:t>3.2</w:t>
+              <w:t>3.6</w:t>
             </w:r>
           </w:p>
         </w:tc>
@@ -29016,7 +30266,7 @@
         <w:spacing w:before="120" w:after="120" w:line="264" w:lineRule="auto"/>
       </w:pPr>
       <w:r>
-        <w:t>Phases 0–4 total about 321.8 MD (182.5 development, 31.7 design, 78.3 testing, 29.3 product management) – about 3.2 FTE on average for five months (peak 3.9 FTE in Phase 2), with development at about 57% of total effort. Of this, 47.3 MD (43 MD of features plus product management) are the additions from the RESPONSIBLE-AI roadmap review (section 1.3).</w:t>
+        <w:t>Phases 0–4 total about 355.9 MD (200.5 development, 36.7 design, 86.3 testing, 32.4 product management) – about 3.6 FTE on average for five months (peak 5.6 FTE in Phase 2), with development at about 56% of total effort. Of this, 81.4 MD (74 MD of features plus product management) are the additions from the RESPONSIBLE-AI roadmap review (section 1.3).</w:t>
       </w:r>
     </w:p>
     <w:p>
@@ -29662,7 +30912,7 @@
                 <w:sz w:val="16"/>
                 <w:szCs w:val="16"/>
               </w:rPr>
-              <w:t>70.5</w:t>
+              <w:t>101.5</w:t>
             </w:r>
           </w:p>
         </w:tc>
@@ -29691,7 +30941,7 @@
                 <w:sz w:val="16"/>
                 <w:szCs w:val="16"/>
               </w:rPr>
-              <w:t>20.5</w:t>
+              <w:t>51.5</w:t>
             </w:r>
           </w:p>
         </w:tc>
@@ -29720,7 +30970,7 @@
                 <w:sz w:val="16"/>
                 <w:szCs w:val="16"/>
               </w:rPr>
-              <w:t>Revised by the Activate team: LangGraph agentic workflows and an agentic batch-processing app replace the NEA port (moved to Phase 4) and the tenant portal (moved to Phase 0). Plus † as-built cache hardening (4.5 MD). Plus † scoped gateway settings (8 MD), guided configuration (5 MD) and LiteLLM capability discovery (4 MD)</w:t>
+              <w:t>Revised by the Activate team: LangGraph agentic workflows and an agentic batch-processing app replace the NEA port (moved to Phase 4) and the tenant portal (moved to Phase 0). Plus † as-built cache hardening (4.5 MD). Plus † scoped gateway settings (8 MD), guided configuration (5 MD) and LiteLLM capability discovery (4 MD). Plus † Workflow Studio (31 MD; 34.1 MD incl. PM) added in release 1.6</w:t>
             </w:r>
             <w:proofErr w:type="spellStart"/>
             <w:r>
@@ -30138,7 +31388,7 @@
         <w:spacing w:after="60"/>
       </w:pPr>
       <w:r>
-        <w:t>Additions (†) from the RESPONSIBLE-AI-ENTERPRISEREADY roadmap review (2 October 2026), 43 MD of feature effort plus 4.3 MD product management: integration contract (Phase 0, 4 MD); gateway admin console (Phase 1, 6 MD); scoped gateway settings, guided configuration and LiteLLM capability discovery (Phase 2, 17 MD); app credentials, token exchange and events plus admin audit view (Phase 3, 8 MD); configuration copilot (Phase 4, 8 MD). The estimates are proposals for the Activate team’s review. Risk: Phase 2 becomes the peak phase (3.9 FTE); if that is too high, the LiteLLM capability discovery row (4 MD) can move to Phase 3 and the guided-configuration row (5 MD) to Phase 4 alongside the copilot.</w:t>
+        <w:t>Additions (†) from the RESPONSIBLE-AI-ENTERPRISEREADY roadmap review (2 October 2026), 43 MD of feature effort plus 4.3 MD product management: integration contract (Phase 0, 4 MD); gateway admin console (Phase 1, 6 MD); scoped gateway settings, guided configuration and LiteLLM capability discovery (Phase 2, 17 MD); app credentials, token exchange and events plus admin audit view (Phase 3, 8 MD); configuration copilot (Phase 4, 8 MD). The estimates are proposals for the Activate team’s review. Risk: Phase 2 becomes the peak phase (5.6 FTE); if that is too high, the LiteLLM capability discovery row (4 MD) can move to Phase 3 and the guided-configuration row (5 MD) to Phase 4 alongside the copilot.</w:t>
       </w:r>
       <w:proofErr w:type="spellStart"/>
       <w:r/>
@@ -30148,6 +31398,19 @@
       <w:r/>
       <w:proofErr w:type="spellEnd"/>
       <w:r/>
+    </w:p>
+    <w:p>
+      <w:pPr>
+        <w:pStyle w:val="ListParagraph"/>
+        <w:numPr>
+          <w:ilvl w:val="0"/>
+          <w:numId w:val="2"/>
+        </w:numPr>
+        <w:spacing w:after="60"/>
+      </w:pPr>
+      <w:r>
+        <w:t>Additions (†) from the RESPONSIBLE-AI-ENTERPRISEREADY Workflow Studio track (3 October 2026, release 1.6), 31 MD of feature effort plus 3.1 MD product management, all in Phase 2 (AI Apps): portal-native flow builder over the workflow engine API (14 MD); runs, template gallery, data picker and versions (8 MD); engine internal only, router / loop / code steps and OAuth2 connections (9 MD). The estimates are for the port to the Activate core and are proposals for the Activate team’s review. Risk: Phase 2 rises to 111.7 MD (5.6 FTE against 3.7 FTE in Phase 1); if that is too high, the engine-internal row (9 MD) can move to Phase 3.</w:t>
+      </w:r>
     </w:p>
     <w:p>
       <w:pPr>
@@ -30243,7 +31506,7 @@
         <w:spacing w:after="60"/>
       </w:pPr>
       <w:r>
-        <w:t>Load by phase: Phase 0 51.7 MD, Phase 1 73.7 MD, Phase 2 77.6 MD, Phase 3 60.5 MD, Phase 4 58.3 MD. The peak is Phase 2 at about 3.9 FTE; the plan is loaded between 2.6 and 3.9 FTE.</w:t>
+        <w:t>Load by phase: Phase 0 51.7 MD, Phase 1 73.7 MD, Phase 2 111.7 MD, Phase 3 60.5 MD, Phase 4 58.3 MD. The peak is Phase 2 at about 5.6 FTE; the plan is loaded between 2.6 and 5.6 FTE.</w:t>
       </w:r>
     </w:p>
     <w:p>
@@ -31832,7 +33095,7 @@
         <w:spacing w:before="120" w:after="120" w:line="264" w:lineRule="auto"/>
       </w:pPr>
       <w:r>
-        <w:t>Phases 0–4 (≈ 321.8 MD) plus the backlog (≈ 491 MD) gives about 812.8 MD to the full platform vision with AI-assisted delivery.</w:t>
+        <w:t>Phases 0–4 (≈ 355.9 MD) plus the backlog (≈ 491 MD) gives about 846.9 MD to the full platform vision with AI-assisted delivery.</w:t>
       </w:r>
     </w:p>
     <w:sectPr>

</xml_diff>

<commit_message>
Docs: Activate AI Platform Overall Roadmap v1.7 mirrors the AWS integration sprints
Word specification (docs/AI platform /): release 1.7 history line; two † rows in Phase 3 for AQ-1 (12 MD)
and AQ-2 (8 MD) with product management at 10 %; section 1.3 mapping rows; sections 1.2, 3.1, 3.2, 3.3 and 4
recalculated (Phases 0–4 total 355.9 → 377.9 MD); section 5 backlog unchanged. ROADMAP.md note updated to v1.7.

Co-Authored-By: Claude Fable 5.1 <noreply@anthropic.com>
</commit_message>
<xml_diff>
--- a/docs/AI platform /Activate_AI_Platform_Overall_Roadmap.docx
+++ b/docs/AI platform /Activate_AI_Platform_Overall_Roadmap.docx
@@ -53,6 +53,19 @@
       </w:r>
       <w:r>
         <w:t>Activate Interactive Pte Ltd</w:t>
+      </w:r>
+    </w:p>
+    <w:p>
+      <w:pPr>
+        <w:spacing w:after="80"/>
+      </w:pPr>
+      <w:r>
+        <w:rPr>
+          <w:b/>
+          <w:bCs/>
+          <w:color w:val="595959"/>
+        </w:rPr>
+        <w:t>Release: 1.7 (Draft for review) – AWS integration: Bedrock Agents, Bedrock Flows, OpenSearch and Amazon Quick Suite as workflow pieces with the engine task role as identity, and workflow apps published as MCP tools for external agents such as Quick Suite chat agents (RESPONSIBLE-AI-ENTERPRISEREADY roadmap, Sprints AQ-1 and AQ-2, delivered 2026-10-05 in the reference implementation). Two † rows added to Phase 3 (20 MD of features plus 2 MD product management); mapping in section 1.3; sections 1.2, 3 and 4 recalculated; section 5 unchanged.</w:t>
       </w:r>
     </w:p>
     <w:p>
@@ -130,7 +143,7 @@
           <w:bCs/>
           <w:color w:val="595959"/>
         </w:rPr>
-        <w:t>Sources: Activate Roadmap Timeline slide (Phases 0–4); AI Gateway Recommended Architecture v1.7; AI App Platform Recommended Architecture v1.5; AI Gateway LiteLLM Detailed Design v1.1; RESPONSIBLE-AI-ENTERPRISEREADY roadmap and Proxy Manager enterprise design (2 Oct 2026); RESPONSIBLE-AI supply-chain trust proposal, SUPPLY_CHAIN_TRUST.md (3 Oct 2026); RESPONSIBLE-AI Workflow Studio plan, WORKFLOW_STUDIO_PLAN.md, and roadmap Sprints WS-1 to WS-3 (3 Oct 2026)</w:t>
+        <w:t>Sources: Activate Roadmap Timeline slide (Phases 0–4); AI Gateway Recommended Architecture v1.7; AI App Platform Recommended Architecture v1.5; AI Gateway LiteLLM Detailed Design v1.1; RESPONSIBLE-AI-ENTERPRISEREADY roadmap and Proxy Manager enterprise design (2 Oct 2026); RESPONSIBLE-AI supply-chain trust proposal, SUPPLY_CHAIN_TRUST.md (3 Oct 2026); RESPONSIBLE-AI Workflow Studio plan, WORKFLOW_STUDIO_PLAN.md, and roadmap Sprints WS-1 to WS-3 (3 Oct 2026); RESPONSIBLE-AI roadmap Sprints AQ-1 and AQ-2, MCP_PUBLISHING.md (5 Oct 2026)</w:t>
       </w:r>
       <w:r/>
       <w:proofErr w:type="spellStart"/>
@@ -2979,7 +2992,7 @@
                 <w:sz w:val="16"/>
                 <w:szCs w:val="16"/>
               </w:rPr>
-              <w:t>355.9 MD</w:t>
+              <w:t>377.9 MD</w:t>
             </w:r>
           </w:p>
         </w:tc>
@@ -3008,7 +3021,7 @@
                 <w:sz w:val="16"/>
                 <w:szCs w:val="16"/>
               </w:rPr>
-              <w:t>Workflow Studio † rows in Phase 2 (release 1.6): 31 MD of features plus 3.1 MD product management</w:t>
+              <w:t>Workflow Studio † rows in Phase 2 (release 1.6): 31 MD of features plus 3.1 MD product management; AWS integration † rows in Phase 3 (release 1.7): 20 MD plus 2 MD product management</w:t>
             </w:r>
           </w:p>
         </w:tc>
@@ -5296,6 +5309,260 @@
                 <w:szCs w:val="16"/>
               </w:rPr>
               <w:t>9</w:t>
+            </w:r>
+          </w:p>
+        </w:tc>
+        <w:tc>
+          <w:tcPr>
+            <w:tcW w:w="5680" w:type="dxa"/>
+            <w:tcBorders>
+              <w:top w:val="single" w:sz="4" w:space="0" w:color="8497B0"/>
+              <w:left w:val="single" w:sz="4" w:space="0" w:color="8497B0"/>
+              <w:bottom w:val="single" w:sz="4" w:space="0" w:color="8497B0"/>
+              <w:right w:val="single" w:sz="4" w:space="0" w:color="8497B0"/>
+            </w:tcBorders>
+            <w:tcMar>
+              <w:top w:w="60" w:type="dxa"/>
+              <w:left w:w="100" w:type="dxa"/>
+              <w:bottom w:w="60" w:type="dxa"/>
+              <w:right w:w="100" w:type="dxa"/>
+            </w:tcMar>
+          </w:tcPr>
+          <w:p>
+            <w:pPr>
+              <w:spacing w:after="40"/>
+            </w:pPr>
+            <w:r>
+              <w:rPr>
+                <w:sz w:val="16"/>
+                <w:szCs w:val="16"/>
+              </w:rPr>
+              <w:t>New † row</w:t>
+            </w:r>
+          </w:p>
+        </w:tc>
+      </w:tr>
+      <w:tr>
+        <w:tblPrEx>
+          <w:tblCellMar>
+            <w:top w:w="0" w:type="dxa"/>
+            <w:bottom w:w="0" w:type="dxa"/>
+          </w:tblCellMar>
+        </w:tblPrEx>
+        <w:trPr>
+          <w:cantSplit/>
+        </w:trPr>
+        <w:tc>
+          <w:tcPr>
+            <w:tcW w:w="3000" w:type="dxa"/>
+            <w:tcBorders>
+              <w:top w:val="single" w:sz="4" w:space="0" w:color="8497B0"/>
+              <w:left w:val="single" w:sz="4" w:space="0" w:color="8497B0"/>
+              <w:bottom w:val="single" w:sz="4" w:space="0" w:color="8497B0"/>
+              <w:right w:val="single" w:sz="4" w:space="0" w:color="8497B0"/>
+            </w:tcBorders>
+            <w:tcMar>
+              <w:top w:w="60" w:type="dxa"/>
+              <w:left w:w="100" w:type="dxa"/>
+              <w:bottom w:w="60" w:type="dxa"/>
+              <w:right w:w="100" w:type="dxa"/>
+            </w:tcMar>
+          </w:tcPr>
+          <w:p>
+            <w:pPr>
+              <w:spacing w:after="40"/>
+            </w:pPr>
+            <w:r>
+              <w:rPr>
+                <w:sz w:val="16"/>
+                <w:szCs w:val="16"/>
+              </w:rPr>
+              <w:t>AWS integration AQ-1 – AWS pieces (Bedrock Agents/Flows, OpenSearch, Quick Suite) with task-role identity</w:t>
+            </w:r>
+          </w:p>
+        </w:tc>
+        <w:tc>
+          <w:tcPr>
+            <w:tcW w:w="2600" w:type="dxa"/>
+            <w:tcBorders>
+              <w:top w:val="single" w:sz="4" w:space="0" w:color="8497B0"/>
+              <w:left w:val="single" w:sz="4" w:space="0" w:color="8497B0"/>
+              <w:bottom w:val="single" w:sz="4" w:space="0" w:color="8497B0"/>
+              <w:right w:val="single" w:sz="4" w:space="0" w:color="8497B0"/>
+            </w:tcBorders>
+            <w:tcMar>
+              <w:top w:w="60" w:type="dxa"/>
+              <w:left w:w="100" w:type="dxa"/>
+              <w:bottom w:w="60" w:type="dxa"/>
+              <w:right w:w="100" w:type="dxa"/>
+            </w:tcMar>
+          </w:tcPr>
+          <w:p>
+            <w:pPr>
+              <w:spacing w:after="40"/>
+            </w:pPr>
+            <w:r>
+              <w:rPr>
+                <w:sz w:val="16"/>
+                <w:szCs w:val="16"/>
+              </w:rPr>
+              <w:t>Phase 3 row 10 AWS pieces</w:t>
+            </w:r>
+          </w:p>
+        </w:tc>
+        <w:tc>
+          <w:tcPr>
+            <w:tcW w:w="2400" w:type="dxa"/>
+            <w:tcBorders>
+              <w:top w:val="single" w:sz="4" w:space="0" w:color="8497B0"/>
+              <w:left w:val="single" w:sz="4" w:space="0" w:color="8497B0"/>
+              <w:bottom w:val="single" w:sz="4" w:space="0" w:color="8497B0"/>
+              <w:right w:val="single" w:sz="4" w:space="0" w:color="8497B0"/>
+            </w:tcBorders>
+            <w:tcMar>
+              <w:top w:w="60" w:type="dxa"/>
+              <w:left w:w="100" w:type="dxa"/>
+              <w:bottom w:w="60" w:type="dxa"/>
+              <w:right w:w="100" w:type="dxa"/>
+            </w:tcMar>
+          </w:tcPr>
+          <w:p>
+            <w:pPr>
+              <w:spacing w:after="40"/>
+            </w:pPr>
+            <w:r>
+              <w:rPr>
+                <w:sz w:val="16"/>
+                <w:szCs w:val="16"/>
+              </w:rPr>
+              <w:t>12</w:t>
+            </w:r>
+          </w:p>
+        </w:tc>
+        <w:tc>
+          <w:tcPr>
+            <w:tcW w:w="5680" w:type="dxa"/>
+            <w:tcBorders>
+              <w:top w:val="single" w:sz="4" w:space="0" w:color="8497B0"/>
+              <w:left w:val="single" w:sz="4" w:space="0" w:color="8497B0"/>
+              <w:bottom w:val="single" w:sz="4" w:space="0" w:color="8497B0"/>
+              <w:right w:val="single" w:sz="4" w:space="0" w:color="8497B0"/>
+            </w:tcBorders>
+            <w:tcMar>
+              <w:top w:w="60" w:type="dxa"/>
+              <w:left w:w="100" w:type="dxa"/>
+              <w:bottom w:w="60" w:type="dxa"/>
+              <w:right w:w="100" w:type="dxa"/>
+            </w:tcMar>
+          </w:tcPr>
+          <w:p>
+            <w:pPr>
+              <w:spacing w:after="40"/>
+            </w:pPr>
+            <w:r>
+              <w:rPr>
+                <w:sz w:val="16"/>
+                <w:szCs w:val="16"/>
+              </w:rPr>
+              <w:t>New † row</w:t>
+            </w:r>
+          </w:p>
+        </w:tc>
+      </w:tr>
+      <w:tr>
+        <w:tblPrEx>
+          <w:tblCellMar>
+            <w:top w:w="0" w:type="dxa"/>
+            <w:bottom w:w="0" w:type="dxa"/>
+          </w:tblCellMar>
+        </w:tblPrEx>
+        <w:trPr>
+          <w:cantSplit/>
+        </w:trPr>
+        <w:tc>
+          <w:tcPr>
+            <w:tcW w:w="3000" w:type="dxa"/>
+            <w:tcBorders>
+              <w:top w:val="single" w:sz="4" w:space="0" w:color="8497B0"/>
+              <w:left w:val="single" w:sz="4" w:space="0" w:color="8497B0"/>
+              <w:bottom w:val="single" w:sz="4" w:space="0" w:color="8497B0"/>
+              <w:right w:val="single" w:sz="4" w:space="0" w:color="8497B0"/>
+            </w:tcBorders>
+            <w:tcMar>
+              <w:top w:w="60" w:type="dxa"/>
+              <w:left w:w="100" w:type="dxa"/>
+              <w:bottom w:w="60" w:type="dxa"/>
+              <w:right w:w="100" w:type="dxa"/>
+            </w:tcMar>
+          </w:tcPr>
+          <w:p>
+            <w:pPr>
+              <w:spacing w:after="40"/>
+            </w:pPr>
+            <w:r>
+              <w:rPr>
+                <w:sz w:val="16"/>
+                <w:szCs w:val="16"/>
+              </w:rPr>
+              <w:t>AWS integration AQ-2 – workflow apps published as MCP tools</w:t>
+            </w:r>
+          </w:p>
+        </w:tc>
+        <w:tc>
+          <w:tcPr>
+            <w:tcW w:w="2600" w:type="dxa"/>
+            <w:tcBorders>
+              <w:top w:val="single" w:sz="4" w:space="0" w:color="8497B0"/>
+              <w:left w:val="single" w:sz="4" w:space="0" w:color="8497B0"/>
+              <w:bottom w:val="single" w:sz="4" w:space="0" w:color="8497B0"/>
+              <w:right w:val="single" w:sz="4" w:space="0" w:color="8497B0"/>
+            </w:tcBorders>
+            <w:tcMar>
+              <w:top w:w="60" w:type="dxa"/>
+              <w:left w:w="100" w:type="dxa"/>
+              <w:bottom w:w="60" w:type="dxa"/>
+              <w:right w:w="100" w:type="dxa"/>
+            </w:tcMar>
+          </w:tcPr>
+          <w:p>
+            <w:pPr>
+              <w:spacing w:after="40"/>
+            </w:pPr>
+            <w:r>
+              <w:rPr>
+                <w:sz w:val="16"/>
+                <w:szCs w:val="16"/>
+              </w:rPr>
+              <w:t>Phase 3 row 11 MCP publishing</w:t>
+            </w:r>
+          </w:p>
+        </w:tc>
+        <w:tc>
+          <w:tcPr>
+            <w:tcW w:w="2400" w:type="dxa"/>
+            <w:tcBorders>
+              <w:top w:val="single" w:sz="4" w:space="0" w:color="8497B0"/>
+              <w:left w:val="single" w:sz="4" w:space="0" w:color="8497B0"/>
+              <w:bottom w:val="single" w:sz="4" w:space="0" w:color="8497B0"/>
+              <w:right w:val="single" w:sz="4" w:space="0" w:color="8497B0"/>
+            </w:tcBorders>
+            <w:tcMar>
+              <w:top w:w="60" w:type="dxa"/>
+              <w:left w:w="100" w:type="dxa"/>
+              <w:bottom w:w="60" w:type="dxa"/>
+              <w:right w:w="100" w:type="dxa"/>
+            </w:tcMar>
+          </w:tcPr>
+          <w:p>
+            <w:pPr>
+              <w:spacing w:after="40"/>
+            </w:pPr>
+            <w:r>
+              <w:rPr>
+                <w:sz w:val="16"/>
+                <w:szCs w:val="16"/>
+              </w:rPr>
+              <w:t>8</w:t>
             </w:r>
           </w:p>
         </w:tc>
@@ -19331,7 +19598,6 @@
               <w:bottom w:val="single" w:sz="4" w:space="0" w:color="8497B0"/>
               <w:right w:val="single" w:sz="4" w:space="0" w:color="8497B0"/>
             </w:tcBorders>
-            <w:shd w:val="clear" w:color="auto" w:fill="EEF1F5"/>
             <w:tcMar>
               <w:top w:w="60" w:type="dxa"/>
               <w:left w:w="100" w:type="dxa"/>
@@ -19361,24 +19627,23 @@
               <w:bottom w:val="single" w:sz="4" w:space="0" w:color="8497B0"/>
               <w:right w:val="single" w:sz="4" w:space="0" w:color="8497B0"/>
             </w:tcBorders>
-            <w:shd w:val="clear" w:color="auto" w:fill="EEF1F5"/>
-            <w:tcMar>
-              <w:top w:w="60" w:type="dxa"/>
-              <w:left w:w="100" w:type="dxa"/>
-              <w:bottom w:w="60" w:type="dxa"/>
-              <w:right w:w="100" w:type="dxa"/>
-            </w:tcMar>
-          </w:tcPr>
-          <w:p>
-            <w:pPr>
-              <w:spacing w:after="40"/>
-            </w:pPr>
-            <w:r>
-              <w:rPr>
-                <w:sz w:val="16"/>
-                <w:szCs w:val="16"/>
-              </w:rPr>
-              <w:t>Continuous architecture, design, testing *</w:t>
+            <w:tcMar>
+              <w:top w:w="60" w:type="dxa"/>
+              <w:left w:w="100" w:type="dxa"/>
+              <w:bottom w:w="60" w:type="dxa"/>
+              <w:right w:w="100" w:type="dxa"/>
+            </w:tcMar>
+          </w:tcPr>
+          <w:p>
+            <w:pPr>
+              <w:spacing w:after="40"/>
+            </w:pPr>
+            <w:r>
+              <w:rPr>
+                <w:sz w:val="16"/>
+                <w:szCs w:val="16"/>
+              </w:rPr>
+              <w:t>AWS pieces – Bedrock Agents, Bedrock Flows, OpenSearch and Quick Suite as workflow steps, engine task role identity, IAM, governance badges †</w:t>
             </w:r>
           </w:p>
         </w:tc>
@@ -19391,24 +19656,23 @@
               <w:bottom w:val="single" w:sz="4" w:space="0" w:color="8497B0"/>
               <w:right w:val="single" w:sz="4" w:space="0" w:color="8497B0"/>
             </w:tcBorders>
-            <w:shd w:val="clear" w:color="auto" w:fill="EEF1F5"/>
-            <w:tcMar>
-              <w:top w:w="60" w:type="dxa"/>
-              <w:left w:w="100" w:type="dxa"/>
-              <w:bottom w:w="60" w:type="dxa"/>
-              <w:right w:w="100" w:type="dxa"/>
-            </w:tcMar>
-          </w:tcPr>
-          <w:p>
-            <w:pPr>
-              <w:spacing w:after="40"/>
-            </w:pPr>
-            <w:r>
-              <w:rPr>
-                <w:sz w:val="16"/>
-                <w:szCs w:val="16"/>
-              </w:rPr>
-              <w:t>Shared (continuous)</w:t>
+            <w:tcMar>
+              <w:top w:w="60" w:type="dxa"/>
+              <w:left w:w="100" w:type="dxa"/>
+              <w:bottom w:w="60" w:type="dxa"/>
+              <w:right w:w="100" w:type="dxa"/>
+            </w:tcMar>
+          </w:tcPr>
+          <w:p>
+            <w:pPr>
+              <w:spacing w:after="40"/>
+            </w:pPr>
+            <w:r>
+              <w:rPr>
+                <w:sz w:val="16"/>
+                <w:szCs w:val="16"/>
+              </w:rPr>
+              <w:t>AI Apps</w:t>
             </w:r>
           </w:p>
         </w:tc>
@@ -19421,24 +19685,23 @@
               <w:bottom w:val="single" w:sz="4" w:space="0" w:color="8497B0"/>
               <w:right w:val="single" w:sz="4" w:space="0" w:color="8497B0"/>
             </w:tcBorders>
-            <w:shd w:val="clear" w:color="auto" w:fill="EEF1F5"/>
-            <w:tcMar>
-              <w:top w:w="60" w:type="dxa"/>
-              <w:left w:w="100" w:type="dxa"/>
-              <w:bottom w:w="60" w:type="dxa"/>
-              <w:right w:w="100" w:type="dxa"/>
-            </w:tcMar>
-          </w:tcPr>
-          <w:p>
-            <w:pPr>
-              <w:spacing w:after="40"/>
-            </w:pPr>
-            <w:r>
-              <w:rPr>
-                <w:sz w:val="16"/>
-                <w:szCs w:val="16"/>
-              </w:rPr>
-              <w:t>1.6</w:t>
+            <w:tcMar>
+              <w:top w:w="60" w:type="dxa"/>
+              <w:left w:w="100" w:type="dxa"/>
+              <w:bottom w:w="60" w:type="dxa"/>
+              <w:right w:w="100" w:type="dxa"/>
+            </w:tcMar>
+          </w:tcPr>
+          <w:p>
+            <w:pPr>
+              <w:spacing w:after="40"/>
+            </w:pPr>
+            <w:r>
+              <w:rPr>
+                <w:sz w:val="16"/>
+                <w:szCs w:val="16"/>
+              </w:rPr>
+              <w:t>2</w:t>
             </w:r>
           </w:p>
         </w:tc>
@@ -19451,24 +19714,23 @@
               <w:bottom w:val="single" w:sz="4" w:space="0" w:color="8497B0"/>
               <w:right w:val="single" w:sz="4" w:space="0" w:color="8497B0"/>
             </w:tcBorders>
-            <w:shd w:val="clear" w:color="auto" w:fill="EEF1F5"/>
-            <w:tcMar>
-              <w:top w:w="60" w:type="dxa"/>
-              <w:left w:w="100" w:type="dxa"/>
-              <w:bottom w:w="60" w:type="dxa"/>
-              <w:right w:w="100" w:type="dxa"/>
-            </w:tcMar>
-          </w:tcPr>
-          <w:p>
-            <w:pPr>
-              <w:spacing w:after="40"/>
-            </w:pPr>
-            <w:r>
-              <w:rPr>
-                <w:sz w:val="16"/>
-                <w:szCs w:val="16"/>
-              </w:rPr>
-              <w:t>0</w:t>
+            <w:tcMar>
+              <w:top w:w="60" w:type="dxa"/>
+              <w:left w:w="100" w:type="dxa"/>
+              <w:bottom w:w="60" w:type="dxa"/>
+              <w:right w:w="100" w:type="dxa"/>
+            </w:tcMar>
+          </w:tcPr>
+          <w:p>
+            <w:pPr>
+              <w:spacing w:after="40"/>
+            </w:pPr>
+            <w:r>
+              <w:rPr>
+                <w:sz w:val="16"/>
+                <w:szCs w:val="16"/>
+              </w:rPr>
+              <w:t>8</w:t>
             </w:r>
           </w:p>
         </w:tc>
@@ -19481,24 +19743,23 @@
               <w:bottom w:val="single" w:sz="4" w:space="0" w:color="8497B0"/>
               <w:right w:val="single" w:sz="4" w:space="0" w:color="8497B0"/>
             </w:tcBorders>
-            <w:shd w:val="clear" w:color="auto" w:fill="EEF1F5"/>
-            <w:tcMar>
-              <w:top w:w="60" w:type="dxa"/>
-              <w:left w:w="100" w:type="dxa"/>
-              <w:bottom w:w="60" w:type="dxa"/>
-              <w:right w:w="100" w:type="dxa"/>
-            </w:tcMar>
-          </w:tcPr>
-          <w:p>
-            <w:pPr>
-              <w:spacing w:after="40"/>
-            </w:pPr>
-            <w:r>
-              <w:rPr>
-                <w:sz w:val="16"/>
-                <w:szCs w:val="16"/>
-              </w:rPr>
-              <w:t>2.4</w:t>
+            <w:tcMar>
+              <w:top w:w="60" w:type="dxa"/>
+              <w:left w:w="100" w:type="dxa"/>
+              <w:bottom w:w="60" w:type="dxa"/>
+              <w:right w:w="100" w:type="dxa"/>
+            </w:tcMar>
+          </w:tcPr>
+          <w:p>
+            <w:pPr>
+              <w:spacing w:after="40"/>
+            </w:pPr>
+            <w:r>
+              <w:rPr>
+                <w:sz w:val="16"/>
+                <w:szCs w:val="16"/>
+              </w:rPr>
+              <w:t>2</w:t>
             </w:r>
           </w:p>
         </w:tc>
@@ -19511,7 +19772,6 @@
               <w:bottom w:val="single" w:sz="4" w:space="0" w:color="8497B0"/>
               <w:right w:val="single" w:sz="4" w:space="0" w:color="8497B0"/>
             </w:tcBorders>
-            <w:shd w:val="clear" w:color="auto" w:fill="EEF1F5"/>
             <w:tcMar>
               <w:top w:w="60" w:type="dxa"/>
               <w:left w:w="100" w:type="dxa"/>
@@ -19541,24 +19801,23 @@
               <w:bottom w:val="single" w:sz="4" w:space="0" w:color="8497B0"/>
               <w:right w:val="single" w:sz="4" w:space="0" w:color="8497B0"/>
             </w:tcBorders>
-            <w:shd w:val="clear" w:color="auto" w:fill="EEF1F5"/>
-            <w:tcMar>
-              <w:top w:w="60" w:type="dxa"/>
-              <w:left w:w="100" w:type="dxa"/>
-              <w:bottom w:w="60" w:type="dxa"/>
-              <w:right w:w="100" w:type="dxa"/>
-            </w:tcMar>
-          </w:tcPr>
-          <w:p>
-            <w:pPr>
-              <w:spacing w:after="40"/>
-            </w:pPr>
-            <w:r>
-              <w:rPr>
-                <w:sz w:val="16"/>
-                <w:szCs w:val="16"/>
-              </w:rPr>
-              <w:t>4</w:t>
+            <w:tcMar>
+              <w:top w:w="60" w:type="dxa"/>
+              <w:left w:w="100" w:type="dxa"/>
+              <w:bottom w:w="60" w:type="dxa"/>
+              <w:right w:w="100" w:type="dxa"/>
+            </w:tcMar>
+          </w:tcPr>
+          <w:p>
+            <w:pPr>
+              <w:spacing w:after="40"/>
+            </w:pPr>
+            <w:r>
+              <w:rPr>
+                <w:sz w:val="16"/>
+                <w:szCs w:val="16"/>
+              </w:rPr>
+              <w:t>12</w:t>
             </w:r>
           </w:p>
         </w:tc>
@@ -19593,6 +19852,13 @@
             <w:pPr>
               <w:spacing w:after="40"/>
             </w:pPr>
+            <w:r>
+              <w:rPr>
+                <w:sz w:val="16"/>
+                <w:szCs w:val="16"/>
+              </w:rPr>
+              <w:t>11</w:t>
+            </w:r>
           </w:p>
         </w:tc>
         <w:tc>
@@ -19620,7 +19886,7 @@
                 <w:sz w:val="16"/>
                 <w:szCs w:val="16"/>
               </w:rPr>
-              <w:t>Product management (10% of phase effort)</w:t>
+              <w:t>MCP publishing – workflow apps exposed as tools of a gateway MCP server (keys, tenant scoping, Quick Suite / Claude / LiteLLM connection) †</w:t>
             </w:r>
           </w:p>
         </w:tc>
@@ -19649,7 +19915,7 @@
                 <w:sz w:val="16"/>
                 <w:szCs w:val="16"/>
               </w:rPr>
-              <w:t>Programme</w:t>
+              <w:t>AI Apps</w:t>
             </w:r>
           </w:p>
         </w:tc>
@@ -19678,99 +19944,99 @@
                 <w:sz w:val="16"/>
                 <w:szCs w:val="16"/>
               </w:rPr>
+              <w:t>1</w:t>
+            </w:r>
+          </w:p>
+        </w:tc>
+        <w:tc>
+          <w:tcPr>
+            <w:tcW w:w="1300" w:type="dxa"/>
+            <w:tcBorders>
+              <w:top w:val="single" w:sz="4" w:space="0" w:color="8497B0"/>
+              <w:left w:val="single" w:sz="4" w:space="0" w:color="8497B0"/>
+              <w:bottom w:val="single" w:sz="4" w:space="0" w:color="8497B0"/>
+              <w:right w:val="single" w:sz="4" w:space="0" w:color="8497B0"/>
+            </w:tcBorders>
+            <w:tcMar>
+              <w:top w:w="60" w:type="dxa"/>
+              <w:left w:w="100" w:type="dxa"/>
+              <w:bottom w:w="60" w:type="dxa"/>
+              <w:right w:w="100" w:type="dxa"/>
+            </w:tcMar>
+          </w:tcPr>
+          <w:p>
+            <w:pPr>
+              <w:spacing w:after="40"/>
+            </w:pPr>
+            <w:r>
+              <w:rPr>
+                <w:sz w:val="16"/>
+                <w:szCs w:val="16"/>
+              </w:rPr>
+              <w:t>5</w:t>
+            </w:r>
+          </w:p>
+        </w:tc>
+        <w:tc>
+          <w:tcPr>
+            <w:tcW w:w="1100" w:type="dxa"/>
+            <w:tcBorders>
+              <w:top w:val="single" w:sz="4" w:space="0" w:color="8497B0"/>
+              <w:left w:val="single" w:sz="4" w:space="0" w:color="8497B0"/>
+              <w:bottom w:val="single" w:sz="4" w:space="0" w:color="8497B0"/>
+              <w:right w:val="single" w:sz="4" w:space="0" w:color="8497B0"/>
+            </w:tcBorders>
+            <w:tcMar>
+              <w:top w:w="60" w:type="dxa"/>
+              <w:left w:w="100" w:type="dxa"/>
+              <w:bottom w:w="60" w:type="dxa"/>
+              <w:right w:w="100" w:type="dxa"/>
+            </w:tcMar>
+          </w:tcPr>
+          <w:p>
+            <w:pPr>
+              <w:spacing w:after="40"/>
+            </w:pPr>
+            <w:r>
+              <w:rPr>
+                <w:sz w:val="16"/>
+                <w:szCs w:val="16"/>
+              </w:rPr>
+              <w:t>2</w:t>
+            </w:r>
+          </w:p>
+        </w:tc>
+        <w:tc>
+          <w:tcPr>
+            <w:tcW w:w="1300" w:type="dxa"/>
+            <w:tcBorders>
+              <w:top w:val="single" w:sz="4" w:space="0" w:color="8497B0"/>
+              <w:left w:val="single" w:sz="4" w:space="0" w:color="8497B0"/>
+              <w:bottom w:val="single" w:sz="4" w:space="0" w:color="8497B0"/>
+              <w:right w:val="single" w:sz="4" w:space="0" w:color="8497B0"/>
+            </w:tcBorders>
+            <w:tcMar>
+              <w:top w:w="60" w:type="dxa"/>
+              <w:left w:w="100" w:type="dxa"/>
+              <w:bottom w:w="60" w:type="dxa"/>
+              <w:right w:w="100" w:type="dxa"/>
+            </w:tcMar>
+          </w:tcPr>
+          <w:p>
+            <w:pPr>
+              <w:spacing w:after="40"/>
+            </w:pPr>
+            <w:r>
+              <w:rPr>
+                <w:sz w:val="16"/>
+                <w:szCs w:val="16"/>
+              </w:rPr>
               <w:t>–</w:t>
             </w:r>
           </w:p>
         </w:tc>
         <w:tc>
           <w:tcPr>
-            <w:tcW w:w="1300" w:type="dxa"/>
-            <w:tcBorders>
-              <w:top w:val="single" w:sz="4" w:space="0" w:color="8497B0"/>
-              <w:left w:val="single" w:sz="4" w:space="0" w:color="8497B0"/>
-              <w:bottom w:val="single" w:sz="4" w:space="0" w:color="8497B0"/>
-              <w:right w:val="single" w:sz="4" w:space="0" w:color="8497B0"/>
-            </w:tcBorders>
-            <w:tcMar>
-              <w:top w:w="60" w:type="dxa"/>
-              <w:left w:w="100" w:type="dxa"/>
-              <w:bottom w:w="60" w:type="dxa"/>
-              <w:right w:w="100" w:type="dxa"/>
-            </w:tcMar>
-          </w:tcPr>
-          <w:p>
-            <w:pPr>
-              <w:spacing w:after="40"/>
-            </w:pPr>
-            <w:r>
-              <w:rPr>
-                <w:sz w:val="16"/>
-                <w:szCs w:val="16"/>
-              </w:rPr>
-              <w:t>–</w:t>
-            </w:r>
-          </w:p>
-        </w:tc>
-        <w:tc>
-          <w:tcPr>
-            <w:tcW w:w="1100" w:type="dxa"/>
-            <w:tcBorders>
-              <w:top w:val="single" w:sz="4" w:space="0" w:color="8497B0"/>
-              <w:left w:val="single" w:sz="4" w:space="0" w:color="8497B0"/>
-              <w:bottom w:val="single" w:sz="4" w:space="0" w:color="8497B0"/>
-              <w:right w:val="single" w:sz="4" w:space="0" w:color="8497B0"/>
-            </w:tcBorders>
-            <w:tcMar>
-              <w:top w:w="60" w:type="dxa"/>
-              <w:left w:w="100" w:type="dxa"/>
-              <w:bottom w:w="60" w:type="dxa"/>
-              <w:right w:w="100" w:type="dxa"/>
-            </w:tcMar>
-          </w:tcPr>
-          <w:p>
-            <w:pPr>
-              <w:spacing w:after="40"/>
-            </w:pPr>
-            <w:r>
-              <w:rPr>
-                <w:sz w:val="16"/>
-                <w:szCs w:val="16"/>
-              </w:rPr>
-              <w:t>–</w:t>
-            </w:r>
-          </w:p>
-        </w:tc>
-        <w:tc>
-          <w:tcPr>
-            <w:tcW w:w="1300" w:type="dxa"/>
-            <w:tcBorders>
-              <w:top w:val="single" w:sz="4" w:space="0" w:color="8497B0"/>
-              <w:left w:val="single" w:sz="4" w:space="0" w:color="8497B0"/>
-              <w:bottom w:val="single" w:sz="4" w:space="0" w:color="8497B0"/>
-              <w:right w:val="single" w:sz="4" w:space="0" w:color="8497B0"/>
-            </w:tcBorders>
-            <w:tcMar>
-              <w:top w:w="60" w:type="dxa"/>
-              <w:left w:w="100" w:type="dxa"/>
-              <w:bottom w:w="60" w:type="dxa"/>
-              <w:right w:w="100" w:type="dxa"/>
-            </w:tcMar>
-          </w:tcPr>
-          <w:p>
-            <w:pPr>
-              <w:spacing w:after="40"/>
-            </w:pPr>
-            <w:r>
-              <w:rPr>
-                <w:sz w:val="16"/>
-                <w:szCs w:val="16"/>
-              </w:rPr>
-              <w:t>5.5</w:t>
-            </w:r>
-          </w:p>
-        </w:tc>
-        <w:tc>
-          <w:tcPr>
             <w:tcW w:w="1280" w:type="dxa"/>
             <w:tcBorders>
               <w:top w:val="single" w:sz="4" w:space="0" w:color="8497B0"/>
@@ -19794,7 +20060,7 @@
                 <w:sz w:val="16"/>
                 <w:szCs w:val="16"/>
               </w:rPr>
-              <w:t>5.5</w:t>
+              <w:t>8</w:t>
             </w:r>
           </w:p>
         </w:tc>
@@ -19830,6 +20096,13 @@
             <w:pPr>
               <w:spacing w:after="40"/>
             </w:pPr>
+            <w:r>
+              <w:rPr>
+                <w:sz w:val="16"/>
+                <w:szCs w:val="16"/>
+              </w:rPr>
+              <w:t>12</w:t>
+            </w:r>
           </w:p>
         </w:tc>
         <w:tc>
@@ -19858,6 +20131,486 @@
                 <w:sz w:val="16"/>
                 <w:szCs w:val="16"/>
               </w:rPr>
+              <w:t>Continuous architecture, design, testing *</w:t>
+            </w:r>
+          </w:p>
+        </w:tc>
+        <w:tc>
+          <w:tcPr>
+            <w:tcW w:w="1500" w:type="dxa"/>
+            <w:tcBorders>
+              <w:top w:val="single" w:sz="4" w:space="0" w:color="8497B0"/>
+              <w:left w:val="single" w:sz="4" w:space="0" w:color="8497B0"/>
+              <w:bottom w:val="single" w:sz="4" w:space="0" w:color="8497B0"/>
+              <w:right w:val="single" w:sz="4" w:space="0" w:color="8497B0"/>
+            </w:tcBorders>
+            <w:shd w:val="clear" w:color="auto" w:fill="EEF1F5"/>
+            <w:tcMar>
+              <w:top w:w="60" w:type="dxa"/>
+              <w:left w:w="100" w:type="dxa"/>
+              <w:bottom w:w="60" w:type="dxa"/>
+              <w:right w:w="100" w:type="dxa"/>
+            </w:tcMar>
+          </w:tcPr>
+          <w:p>
+            <w:pPr>
+              <w:spacing w:after="40"/>
+            </w:pPr>
+            <w:r>
+              <w:rPr>
+                <w:sz w:val="16"/>
+                <w:szCs w:val="16"/>
+              </w:rPr>
+              <w:t>Shared (continuous)</w:t>
+            </w:r>
+          </w:p>
+        </w:tc>
+        <w:tc>
+          <w:tcPr>
+            <w:tcW w:w="1100" w:type="dxa"/>
+            <w:tcBorders>
+              <w:top w:val="single" w:sz="4" w:space="0" w:color="8497B0"/>
+              <w:left w:val="single" w:sz="4" w:space="0" w:color="8497B0"/>
+              <w:bottom w:val="single" w:sz="4" w:space="0" w:color="8497B0"/>
+              <w:right w:val="single" w:sz="4" w:space="0" w:color="8497B0"/>
+            </w:tcBorders>
+            <w:shd w:val="clear" w:color="auto" w:fill="EEF1F5"/>
+            <w:tcMar>
+              <w:top w:w="60" w:type="dxa"/>
+              <w:left w:w="100" w:type="dxa"/>
+              <w:bottom w:w="60" w:type="dxa"/>
+              <w:right w:w="100" w:type="dxa"/>
+            </w:tcMar>
+          </w:tcPr>
+          <w:p>
+            <w:pPr>
+              <w:spacing w:after="40"/>
+            </w:pPr>
+            <w:r>
+              <w:rPr>
+                <w:sz w:val="16"/>
+                <w:szCs w:val="16"/>
+              </w:rPr>
+              <w:t>1.6</w:t>
+            </w:r>
+          </w:p>
+        </w:tc>
+        <w:tc>
+          <w:tcPr>
+            <w:tcW w:w="1300" w:type="dxa"/>
+            <w:tcBorders>
+              <w:top w:val="single" w:sz="4" w:space="0" w:color="8497B0"/>
+              <w:left w:val="single" w:sz="4" w:space="0" w:color="8497B0"/>
+              <w:bottom w:val="single" w:sz="4" w:space="0" w:color="8497B0"/>
+              <w:right w:val="single" w:sz="4" w:space="0" w:color="8497B0"/>
+            </w:tcBorders>
+            <w:shd w:val="clear" w:color="auto" w:fill="EEF1F5"/>
+            <w:tcMar>
+              <w:top w:w="60" w:type="dxa"/>
+              <w:left w:w="100" w:type="dxa"/>
+              <w:bottom w:w="60" w:type="dxa"/>
+              <w:right w:w="100" w:type="dxa"/>
+            </w:tcMar>
+          </w:tcPr>
+          <w:p>
+            <w:pPr>
+              <w:spacing w:after="40"/>
+            </w:pPr>
+            <w:r>
+              <w:rPr>
+                <w:sz w:val="16"/>
+                <w:szCs w:val="16"/>
+              </w:rPr>
+              <w:t>0</w:t>
+            </w:r>
+          </w:p>
+        </w:tc>
+        <w:tc>
+          <w:tcPr>
+            <w:tcW w:w="1100" w:type="dxa"/>
+            <w:tcBorders>
+              <w:top w:val="single" w:sz="4" w:space="0" w:color="8497B0"/>
+              <w:left w:val="single" w:sz="4" w:space="0" w:color="8497B0"/>
+              <w:bottom w:val="single" w:sz="4" w:space="0" w:color="8497B0"/>
+              <w:right w:val="single" w:sz="4" w:space="0" w:color="8497B0"/>
+            </w:tcBorders>
+            <w:shd w:val="clear" w:color="auto" w:fill="EEF1F5"/>
+            <w:tcMar>
+              <w:top w:w="60" w:type="dxa"/>
+              <w:left w:w="100" w:type="dxa"/>
+              <w:bottom w:w="60" w:type="dxa"/>
+              <w:right w:w="100" w:type="dxa"/>
+            </w:tcMar>
+          </w:tcPr>
+          <w:p>
+            <w:pPr>
+              <w:spacing w:after="40"/>
+            </w:pPr>
+            <w:r>
+              <w:rPr>
+                <w:sz w:val="16"/>
+                <w:szCs w:val="16"/>
+              </w:rPr>
+              <w:t>2.4</w:t>
+            </w:r>
+          </w:p>
+        </w:tc>
+        <w:tc>
+          <w:tcPr>
+            <w:tcW w:w="1300" w:type="dxa"/>
+            <w:tcBorders>
+              <w:top w:val="single" w:sz="4" w:space="0" w:color="8497B0"/>
+              <w:left w:val="single" w:sz="4" w:space="0" w:color="8497B0"/>
+              <w:bottom w:val="single" w:sz="4" w:space="0" w:color="8497B0"/>
+              <w:right w:val="single" w:sz="4" w:space="0" w:color="8497B0"/>
+            </w:tcBorders>
+            <w:shd w:val="clear" w:color="auto" w:fill="EEF1F5"/>
+            <w:tcMar>
+              <w:top w:w="60" w:type="dxa"/>
+              <w:left w:w="100" w:type="dxa"/>
+              <w:bottom w:w="60" w:type="dxa"/>
+              <w:right w:w="100" w:type="dxa"/>
+            </w:tcMar>
+          </w:tcPr>
+          <w:p>
+            <w:pPr>
+              <w:spacing w:after="40"/>
+            </w:pPr>
+            <w:r>
+              <w:rPr>
+                <w:sz w:val="16"/>
+                <w:szCs w:val="16"/>
+              </w:rPr>
+              <w:t>–</w:t>
+            </w:r>
+          </w:p>
+        </w:tc>
+        <w:tc>
+          <w:tcPr>
+            <w:tcW w:w="1280" w:type="dxa"/>
+            <w:tcBorders>
+              <w:top w:val="single" w:sz="4" w:space="0" w:color="8497B0"/>
+              <w:left w:val="single" w:sz="4" w:space="0" w:color="8497B0"/>
+              <w:bottom w:val="single" w:sz="4" w:space="0" w:color="8497B0"/>
+              <w:right w:val="single" w:sz="4" w:space="0" w:color="8497B0"/>
+            </w:tcBorders>
+            <w:shd w:val="clear" w:color="auto" w:fill="EEF1F5"/>
+            <w:tcMar>
+              <w:top w:w="60" w:type="dxa"/>
+              <w:left w:w="100" w:type="dxa"/>
+              <w:bottom w:w="60" w:type="dxa"/>
+              <w:right w:w="100" w:type="dxa"/>
+            </w:tcMar>
+          </w:tcPr>
+          <w:p>
+            <w:pPr>
+              <w:spacing w:after="40"/>
+            </w:pPr>
+            <w:r>
+              <w:rPr>
+                <w:sz w:val="16"/>
+                <w:szCs w:val="16"/>
+              </w:rPr>
+              <w:t>4</w:t>
+            </w:r>
+          </w:p>
+        </w:tc>
+      </w:tr>
+      <w:tr>
+        <w:tblPrEx>
+          <w:tblCellMar>
+            <w:top w:w="0" w:type="dxa"/>
+            <w:bottom w:w="0" w:type="dxa"/>
+          </w:tblCellMar>
+        </w:tblPrEx>
+        <w:trPr>
+          <w:cantSplit/>
+        </w:trPr>
+        <w:tc>
+          <w:tcPr>
+            <w:tcW w:w="500" w:type="dxa"/>
+            <w:tcBorders>
+              <w:top w:val="single" w:sz="4" w:space="0" w:color="8497B0"/>
+              <w:left w:val="single" w:sz="4" w:space="0" w:color="8497B0"/>
+              <w:bottom w:val="single" w:sz="4" w:space="0" w:color="8497B0"/>
+              <w:right w:val="single" w:sz="4" w:space="0" w:color="8497B0"/>
+            </w:tcBorders>
+            <w:tcMar>
+              <w:top w:w="60" w:type="dxa"/>
+              <w:left w:w="100" w:type="dxa"/>
+              <w:bottom w:w="60" w:type="dxa"/>
+              <w:right w:w="100" w:type="dxa"/>
+            </w:tcMar>
+          </w:tcPr>
+          <w:p>
+            <w:pPr>
+              <w:spacing w:after="40"/>
+            </w:pPr>
+          </w:p>
+        </w:tc>
+        <w:tc>
+          <w:tcPr>
+            <w:tcW w:w="5600" w:type="dxa"/>
+            <w:tcBorders>
+              <w:top w:val="single" w:sz="4" w:space="0" w:color="8497B0"/>
+              <w:left w:val="single" w:sz="4" w:space="0" w:color="8497B0"/>
+              <w:bottom w:val="single" w:sz="4" w:space="0" w:color="8497B0"/>
+              <w:right w:val="single" w:sz="4" w:space="0" w:color="8497B0"/>
+            </w:tcBorders>
+            <w:tcMar>
+              <w:top w:w="60" w:type="dxa"/>
+              <w:left w:w="100" w:type="dxa"/>
+              <w:bottom w:w="60" w:type="dxa"/>
+              <w:right w:w="100" w:type="dxa"/>
+            </w:tcMar>
+          </w:tcPr>
+          <w:p>
+            <w:pPr>
+              <w:spacing w:after="40"/>
+            </w:pPr>
+            <w:r>
+              <w:rPr>
+                <w:sz w:val="16"/>
+                <w:szCs w:val="16"/>
+              </w:rPr>
+              <w:t>Product management (10% of phase effort)</w:t>
+            </w:r>
+          </w:p>
+        </w:tc>
+        <w:tc>
+          <w:tcPr>
+            <w:tcW w:w="1500" w:type="dxa"/>
+            <w:tcBorders>
+              <w:top w:val="single" w:sz="4" w:space="0" w:color="8497B0"/>
+              <w:left w:val="single" w:sz="4" w:space="0" w:color="8497B0"/>
+              <w:bottom w:val="single" w:sz="4" w:space="0" w:color="8497B0"/>
+              <w:right w:val="single" w:sz="4" w:space="0" w:color="8497B0"/>
+            </w:tcBorders>
+            <w:tcMar>
+              <w:top w:w="60" w:type="dxa"/>
+              <w:left w:w="100" w:type="dxa"/>
+              <w:bottom w:w="60" w:type="dxa"/>
+              <w:right w:w="100" w:type="dxa"/>
+            </w:tcMar>
+          </w:tcPr>
+          <w:p>
+            <w:pPr>
+              <w:spacing w:after="40"/>
+            </w:pPr>
+            <w:r>
+              <w:rPr>
+                <w:sz w:val="16"/>
+                <w:szCs w:val="16"/>
+              </w:rPr>
+              <w:t>Programme</w:t>
+            </w:r>
+          </w:p>
+        </w:tc>
+        <w:tc>
+          <w:tcPr>
+            <w:tcW w:w="1100" w:type="dxa"/>
+            <w:tcBorders>
+              <w:top w:val="single" w:sz="4" w:space="0" w:color="8497B0"/>
+              <w:left w:val="single" w:sz="4" w:space="0" w:color="8497B0"/>
+              <w:bottom w:val="single" w:sz="4" w:space="0" w:color="8497B0"/>
+              <w:right w:val="single" w:sz="4" w:space="0" w:color="8497B0"/>
+            </w:tcBorders>
+            <w:tcMar>
+              <w:top w:w="60" w:type="dxa"/>
+              <w:left w:w="100" w:type="dxa"/>
+              <w:bottom w:w="60" w:type="dxa"/>
+              <w:right w:w="100" w:type="dxa"/>
+            </w:tcMar>
+          </w:tcPr>
+          <w:p>
+            <w:pPr>
+              <w:spacing w:after="40"/>
+            </w:pPr>
+            <w:r>
+              <w:rPr>
+                <w:sz w:val="16"/>
+                <w:szCs w:val="16"/>
+              </w:rPr>
+              <w:t>–</w:t>
+            </w:r>
+          </w:p>
+        </w:tc>
+        <w:tc>
+          <w:tcPr>
+            <w:tcW w:w="1300" w:type="dxa"/>
+            <w:tcBorders>
+              <w:top w:val="single" w:sz="4" w:space="0" w:color="8497B0"/>
+              <w:left w:val="single" w:sz="4" w:space="0" w:color="8497B0"/>
+              <w:bottom w:val="single" w:sz="4" w:space="0" w:color="8497B0"/>
+              <w:right w:val="single" w:sz="4" w:space="0" w:color="8497B0"/>
+            </w:tcBorders>
+            <w:tcMar>
+              <w:top w:w="60" w:type="dxa"/>
+              <w:left w:w="100" w:type="dxa"/>
+              <w:bottom w:w="60" w:type="dxa"/>
+              <w:right w:w="100" w:type="dxa"/>
+            </w:tcMar>
+          </w:tcPr>
+          <w:p>
+            <w:pPr>
+              <w:spacing w:after="40"/>
+            </w:pPr>
+            <w:r>
+              <w:rPr>
+                <w:sz w:val="16"/>
+                <w:szCs w:val="16"/>
+              </w:rPr>
+              <w:t>–</w:t>
+            </w:r>
+          </w:p>
+        </w:tc>
+        <w:tc>
+          <w:tcPr>
+            <w:tcW w:w="1100" w:type="dxa"/>
+            <w:tcBorders>
+              <w:top w:val="single" w:sz="4" w:space="0" w:color="8497B0"/>
+              <w:left w:val="single" w:sz="4" w:space="0" w:color="8497B0"/>
+              <w:bottom w:val="single" w:sz="4" w:space="0" w:color="8497B0"/>
+              <w:right w:val="single" w:sz="4" w:space="0" w:color="8497B0"/>
+            </w:tcBorders>
+            <w:tcMar>
+              <w:top w:w="60" w:type="dxa"/>
+              <w:left w:w="100" w:type="dxa"/>
+              <w:bottom w:w="60" w:type="dxa"/>
+              <w:right w:w="100" w:type="dxa"/>
+            </w:tcMar>
+          </w:tcPr>
+          <w:p>
+            <w:pPr>
+              <w:spacing w:after="40"/>
+            </w:pPr>
+            <w:r>
+              <w:rPr>
+                <w:sz w:val="16"/>
+                <w:szCs w:val="16"/>
+              </w:rPr>
+              <w:t>–</w:t>
+            </w:r>
+          </w:p>
+        </w:tc>
+        <w:tc>
+          <w:tcPr>
+            <w:tcW w:w="1300" w:type="dxa"/>
+            <w:tcBorders>
+              <w:top w:val="single" w:sz="4" w:space="0" w:color="8497B0"/>
+              <w:left w:val="single" w:sz="4" w:space="0" w:color="8497B0"/>
+              <w:bottom w:val="single" w:sz="4" w:space="0" w:color="8497B0"/>
+              <w:right w:val="single" w:sz="4" w:space="0" w:color="8497B0"/>
+            </w:tcBorders>
+            <w:tcMar>
+              <w:top w:w="60" w:type="dxa"/>
+              <w:left w:w="100" w:type="dxa"/>
+              <w:bottom w:w="60" w:type="dxa"/>
+              <w:right w:w="100" w:type="dxa"/>
+            </w:tcMar>
+          </w:tcPr>
+          <w:p>
+            <w:pPr>
+              <w:spacing w:after="40"/>
+            </w:pPr>
+            <w:r>
+              <w:rPr>
+                <w:sz w:val="16"/>
+                <w:szCs w:val="16"/>
+              </w:rPr>
+              <w:t>7.5</w:t>
+            </w:r>
+          </w:p>
+        </w:tc>
+        <w:tc>
+          <w:tcPr>
+            <w:tcW w:w="1280" w:type="dxa"/>
+            <w:tcBorders>
+              <w:top w:val="single" w:sz="4" w:space="0" w:color="8497B0"/>
+              <w:left w:val="single" w:sz="4" w:space="0" w:color="8497B0"/>
+              <w:bottom w:val="single" w:sz="4" w:space="0" w:color="8497B0"/>
+              <w:right w:val="single" w:sz="4" w:space="0" w:color="8497B0"/>
+            </w:tcBorders>
+            <w:tcMar>
+              <w:top w:w="60" w:type="dxa"/>
+              <w:left w:w="100" w:type="dxa"/>
+              <w:bottom w:w="60" w:type="dxa"/>
+              <w:right w:w="100" w:type="dxa"/>
+            </w:tcMar>
+          </w:tcPr>
+          <w:p>
+            <w:pPr>
+              <w:spacing w:after="40"/>
+            </w:pPr>
+            <w:r>
+              <w:rPr>
+                <w:sz w:val="16"/>
+                <w:szCs w:val="16"/>
+              </w:rPr>
+              <w:t>7.5</w:t>
+            </w:r>
+          </w:p>
+        </w:tc>
+      </w:tr>
+      <w:tr>
+        <w:tblPrEx>
+          <w:tblCellMar>
+            <w:top w:w="0" w:type="dxa"/>
+            <w:bottom w:w="0" w:type="dxa"/>
+          </w:tblCellMar>
+        </w:tblPrEx>
+        <w:trPr>
+          <w:cantSplit/>
+        </w:trPr>
+        <w:tc>
+          <w:tcPr>
+            <w:tcW w:w="500" w:type="dxa"/>
+            <w:tcBorders>
+              <w:top w:val="single" w:sz="4" w:space="0" w:color="8497B0"/>
+              <w:left w:val="single" w:sz="4" w:space="0" w:color="8497B0"/>
+              <w:bottom w:val="single" w:sz="4" w:space="0" w:color="8497B0"/>
+              <w:right w:val="single" w:sz="4" w:space="0" w:color="8497B0"/>
+            </w:tcBorders>
+            <w:shd w:val="clear" w:color="auto" w:fill="EEF1F5"/>
+            <w:tcMar>
+              <w:top w:w="60" w:type="dxa"/>
+              <w:left w:w="100" w:type="dxa"/>
+              <w:bottom w:w="60" w:type="dxa"/>
+              <w:right w:w="100" w:type="dxa"/>
+            </w:tcMar>
+          </w:tcPr>
+          <w:p>
+            <w:pPr>
+              <w:spacing w:after="40"/>
+            </w:pPr>
+          </w:p>
+        </w:tc>
+        <w:tc>
+          <w:tcPr>
+            <w:tcW w:w="5600" w:type="dxa"/>
+            <w:tcBorders>
+              <w:top w:val="single" w:sz="4" w:space="0" w:color="8497B0"/>
+              <w:left w:val="single" w:sz="4" w:space="0" w:color="8497B0"/>
+              <w:bottom w:val="single" w:sz="4" w:space="0" w:color="8497B0"/>
+              <w:right w:val="single" w:sz="4" w:space="0" w:color="8497B0"/>
+            </w:tcBorders>
+            <w:shd w:val="clear" w:color="auto" w:fill="EEF1F5"/>
+            <w:tcMar>
+              <w:top w:w="60" w:type="dxa"/>
+              <w:left w:w="100" w:type="dxa"/>
+              <w:bottom w:w="60" w:type="dxa"/>
+              <w:right w:w="100" w:type="dxa"/>
+            </w:tcMar>
+          </w:tcPr>
+          <w:p>
+            <w:pPr>
+              <w:spacing w:after="40"/>
+            </w:pPr>
+            <w:r>
+              <w:rPr>
+                <w:sz w:val="16"/>
+                <w:szCs w:val="16"/>
+              </w:rPr>
               <w:t>Phase total</w:t>
             </w:r>
           </w:p>
@@ -19911,7 +20664,7 @@
                 <w:sz w:val="16"/>
                 <w:szCs w:val="16"/>
               </w:rPr>
-              <w:t>2.6</w:t>
+              <w:t>5.6</w:t>
             </w:r>
           </w:p>
         </w:tc>
@@ -19941,7 +20694,7 @@
                 <w:sz w:val="16"/>
                 <w:szCs w:val="16"/>
               </w:rPr>
-              <w:t>41.5</w:t>
+              <w:t>54.5</w:t>
             </w:r>
           </w:p>
         </w:tc>
@@ -19971,7 +20724,7 @@
                 <w:sz w:val="16"/>
                 <w:szCs w:val="16"/>
               </w:rPr>
-              <w:t>10.9</w:t>
+              <w:t>14.9</w:t>
             </w:r>
           </w:p>
         </w:tc>
@@ -20001,7 +20754,7 @@
                 <w:sz w:val="16"/>
                 <w:szCs w:val="16"/>
               </w:rPr>
-              <w:t>5.5</w:t>
+              <w:t>7.5</w:t>
             </w:r>
           </w:p>
         </w:tc>
@@ -20031,7 +20784,7 @@
                 <w:sz w:val="16"/>
                 <w:szCs w:val="16"/>
               </w:rPr>
-              <w:t>60.5</w:t>
+              <w:t>82.5</w:t>
             </w:r>
           </w:p>
         </w:tc>
@@ -23620,41 +24373,41 @@
                 <w:sz w:val="16"/>
                 <w:szCs w:val="16"/>
               </w:rPr>
+              <w:t>5.6</w:t>
+            </w:r>
+          </w:p>
+        </w:tc>
+        <w:tc>
+          <w:tcPr>
+            <w:tcW w:w="1600" w:type="dxa"/>
+            <w:tcBorders>
+              <w:top w:val="single" w:sz="4" w:space="0" w:color="8497B0"/>
+              <w:left w:val="single" w:sz="4" w:space="0" w:color="8497B0"/>
+              <w:bottom w:val="single" w:sz="4" w:space="0" w:color="8497B0"/>
+              <w:right w:val="single" w:sz="4" w:space="0" w:color="8497B0"/>
+            </w:tcBorders>
+            <w:tcMar>
+              <w:top w:w="60" w:type="dxa"/>
+              <w:left w:w="100" w:type="dxa"/>
+              <w:bottom w:w="60" w:type="dxa"/>
+              <w:right w:w="100" w:type="dxa"/>
+            </w:tcMar>
+          </w:tcPr>
+          <w:p>
+            <w:pPr>
+              <w:spacing w:after="40"/>
+            </w:pPr>
+            <w:r>
+              <w:rPr>
+                <w:sz w:val="16"/>
+                <w:szCs w:val="16"/>
+              </w:rPr>
               <w:t>2.6</w:t>
             </w:r>
           </w:p>
         </w:tc>
         <w:tc>
           <w:tcPr>
-            <w:tcW w:w="1600" w:type="dxa"/>
-            <w:tcBorders>
-              <w:top w:val="single" w:sz="4" w:space="0" w:color="8497B0"/>
-              <w:left w:val="single" w:sz="4" w:space="0" w:color="8497B0"/>
-              <w:bottom w:val="single" w:sz="4" w:space="0" w:color="8497B0"/>
-              <w:right w:val="single" w:sz="4" w:space="0" w:color="8497B0"/>
-            </w:tcBorders>
-            <w:tcMar>
-              <w:top w:w="60" w:type="dxa"/>
-              <w:left w:w="100" w:type="dxa"/>
-              <w:bottom w:w="60" w:type="dxa"/>
-              <w:right w:w="100" w:type="dxa"/>
-            </w:tcMar>
-          </w:tcPr>
-          <w:p>
-            <w:pPr>
-              <w:spacing w:after="40"/>
-            </w:pPr>
-            <w:r>
-              <w:rPr>
-                <w:sz w:val="16"/>
-                <w:szCs w:val="16"/>
-              </w:rPr>
-              <w:t>2.6</w:t>
-            </w:r>
-          </w:p>
-        </w:tc>
-        <w:tc>
-          <w:tcPr>
             <w:tcW w:w="2080" w:type="dxa"/>
             <w:tcBorders>
               <w:top w:val="single" w:sz="4" w:space="0" w:color="8497B0"/>
@@ -23678,7 +24431,7 @@
                 <w:sz w:val="16"/>
                 <w:szCs w:val="16"/>
               </w:rPr>
-              <w:t>36.7</w:t>
+              <w:t>39.7</w:t>
             </w:r>
           </w:p>
         </w:tc>
@@ -23841,7 +24594,7 @@
                 <w:sz w:val="16"/>
                 <w:szCs w:val="16"/>
               </w:rPr>
-              <w:t>41.5</w:t>
+              <w:t>54.5</w:t>
             </w:r>
           </w:p>
         </w:tc>
@@ -23901,7 +24654,7 @@
                 <w:sz w:val="16"/>
                 <w:szCs w:val="16"/>
               </w:rPr>
-              <w:t>200.5</w:t>
+              <w:t>213.5</w:t>
             </w:r>
           </w:p>
         </w:tc>
@@ -24059,41 +24812,41 @@
                 <w:sz w:val="16"/>
                 <w:szCs w:val="16"/>
               </w:rPr>
+              <w:t>14.9</w:t>
+            </w:r>
+          </w:p>
+        </w:tc>
+        <w:tc>
+          <w:tcPr>
+            <w:tcW w:w="1600" w:type="dxa"/>
+            <w:tcBorders>
+              <w:top w:val="single" w:sz="4" w:space="0" w:color="8497B0"/>
+              <w:left w:val="single" w:sz="4" w:space="0" w:color="8497B0"/>
+              <w:bottom w:val="single" w:sz="4" w:space="0" w:color="8497B0"/>
+              <w:right w:val="single" w:sz="4" w:space="0" w:color="8497B0"/>
+            </w:tcBorders>
+            <w:tcMar>
+              <w:top w:w="60" w:type="dxa"/>
+              <w:left w:w="100" w:type="dxa"/>
+              <w:bottom w:w="60" w:type="dxa"/>
+              <w:right w:w="100" w:type="dxa"/>
+            </w:tcMar>
+          </w:tcPr>
+          <w:p>
+            <w:pPr>
+              <w:spacing w:after="40"/>
+            </w:pPr>
+            <w:r>
+              <w:rPr>
+                <w:sz w:val="16"/>
+                <w:szCs w:val="16"/>
+              </w:rPr>
               <w:t>10.9</w:t>
             </w:r>
           </w:p>
         </w:tc>
         <w:tc>
           <w:tcPr>
-            <w:tcW w:w="1600" w:type="dxa"/>
-            <w:tcBorders>
-              <w:top w:val="single" w:sz="4" w:space="0" w:color="8497B0"/>
-              <w:left w:val="single" w:sz="4" w:space="0" w:color="8497B0"/>
-              <w:bottom w:val="single" w:sz="4" w:space="0" w:color="8497B0"/>
-              <w:right w:val="single" w:sz="4" w:space="0" w:color="8497B0"/>
-            </w:tcBorders>
-            <w:tcMar>
-              <w:top w:w="60" w:type="dxa"/>
-              <w:left w:w="100" w:type="dxa"/>
-              <w:bottom w:w="60" w:type="dxa"/>
-              <w:right w:w="100" w:type="dxa"/>
-            </w:tcMar>
-          </w:tcPr>
-          <w:p>
-            <w:pPr>
-              <w:spacing w:after="40"/>
-            </w:pPr>
-            <w:r>
-              <w:rPr>
-                <w:sz w:val="16"/>
-                <w:szCs w:val="16"/>
-              </w:rPr>
-              <w:t>10.9</w:t>
-            </w:r>
-          </w:p>
-        </w:tc>
-        <w:tc>
-          <w:tcPr>
             <w:tcW w:w="2080" w:type="dxa"/>
             <w:tcBorders>
               <w:top w:val="single" w:sz="4" w:space="0" w:color="8497B0"/>
@@ -24117,7 +24870,7 @@
                 <w:sz w:val="16"/>
                 <w:szCs w:val="16"/>
               </w:rPr>
-              <w:t>86.3</w:t>
+              <w:t>90.3</w:t>
             </w:r>
           </w:p>
         </w:tc>
@@ -24280,7 +25033,7 @@
                 <w:sz w:val="16"/>
                 <w:szCs w:val="16"/>
               </w:rPr>
-              <w:t>5.5</w:t>
+              <w:t>7.5</w:t>
             </w:r>
           </w:p>
         </w:tc>
@@ -24340,7 +25093,7 @@
                 <w:sz w:val="16"/>
                 <w:szCs w:val="16"/>
               </w:rPr>
-              <w:t>32.4</w:t>
+              <w:t>34.4</w:t>
             </w:r>
           </w:p>
         </w:tc>
@@ -24498,7 +25251,7 @@
                 <w:sz w:val="16"/>
                 <w:szCs w:val="16"/>
               </w:rPr>
-              <w:t>60.5</w:t>
+              <w:t>82.5</w:t>
             </w:r>
           </w:p>
         </w:tc>
@@ -24556,7 +25309,7 @@
                 <w:sz w:val="16"/>
                 <w:szCs w:val="16"/>
               </w:rPr>
-              <w:t>355.9</w:t>
+              <w:t>377.9</w:t>
             </w:r>
           </w:p>
         </w:tc>
@@ -24719,7 +25472,7 @@
                 <w:sz w:val="16"/>
                 <w:szCs w:val="16"/>
               </w:rPr>
-              <w:t>3</w:t>
+              <w:t>4.1</w:t>
             </w:r>
           </w:p>
         </w:tc>
@@ -24779,7 +25532,7 @@
                 <w:sz w:val="16"/>
                 <w:szCs w:val="16"/>
               </w:rPr>
-              <w:t>3.6</w:t>
+              <w:t>3.8</w:t>
             </w:r>
           </w:p>
         </w:tc>
@@ -25429,7 +26182,7 @@
                 <w:sz w:val="16"/>
                 <w:szCs w:val="16"/>
               </w:rPr>
-              <w:t>8</w:t>
+              <w:t>30</w:t>
             </w:r>
           </w:p>
         </w:tc>
@@ -25489,7 +26242,7 @@
                 <w:sz w:val="16"/>
                 <w:szCs w:val="16"/>
               </w:rPr>
-              <w:t>180.4</w:t>
+              <w:t>202.4</w:t>
             </w:r>
           </w:p>
         </w:tc>
@@ -25647,7 +26400,7 @@
                 <w:sz w:val="16"/>
                 <w:szCs w:val="16"/>
               </w:rPr>
-              <w:t>60.5</w:t>
+              <w:t>82.5</w:t>
             </w:r>
           </w:p>
         </w:tc>
@@ -25705,7 +26458,7 @@
                 <w:sz w:val="16"/>
                 <w:szCs w:val="16"/>
               </w:rPr>
-              <w:t>355.9</w:t>
+              <w:t>377.9</w:t>
             </w:r>
           </w:p>
         </w:tc>
@@ -27723,7 +28476,7 @@
                 <w:sz w:val="16"/>
                 <w:szCs w:val="16"/>
               </w:rPr>
-              <w:t>0.6</w:t>
+              <w:t>3.6</w:t>
             </w:r>
           </w:p>
         </w:tc>
@@ -27781,7 +28534,7 @@
                 <w:sz w:val="16"/>
                 <w:szCs w:val="16"/>
               </w:rPr>
-              <w:t>21.3</w:t>
+              <w:t>24.3</w:t>
             </w:r>
           </w:p>
         </w:tc>
@@ -27944,7 +28697,7 @@
                 <w:sz w:val="16"/>
                 <w:szCs w:val="16"/>
               </w:rPr>
-              <w:t>6</w:t>
+              <w:t>19</w:t>
             </w:r>
           </w:p>
         </w:tc>
@@ -28004,7 +28757,7 @@
                 <w:sz w:val="16"/>
                 <w:szCs w:val="16"/>
               </w:rPr>
-              <w:t>99.2</w:t>
+              <w:t>112.2</w:t>
             </w:r>
           </w:p>
         </w:tc>
@@ -28162,7 +28915,7 @@
                 <w:sz w:val="16"/>
                 <w:szCs w:val="16"/>
               </w:rPr>
-              <w:t>0.7</w:t>
+              <w:t>4.7</w:t>
             </w:r>
           </w:p>
         </w:tc>
@@ -28220,7 +28973,7 @@
                 <w:sz w:val="16"/>
                 <w:szCs w:val="16"/>
               </w:rPr>
-              <w:t>43.5</w:t>
+              <w:t>47.5</w:t>
             </w:r>
           </w:p>
         </w:tc>
@@ -28383,7 +29136,7 @@
                 <w:sz w:val="16"/>
                 <w:szCs w:val="16"/>
               </w:rPr>
-              <w:t>0.7</w:t>
+              <w:t>2.7</w:t>
             </w:r>
           </w:p>
         </w:tc>
@@ -28443,7 +29196,7 @@
                 <w:sz w:val="16"/>
                 <w:szCs w:val="16"/>
               </w:rPr>
-              <w:t>16.4</w:t>
+              <w:t>18.4</w:t>
             </w:r>
           </w:p>
         </w:tc>
@@ -28601,7 +29354,7 @@
                 <w:sz w:val="16"/>
                 <w:szCs w:val="16"/>
               </w:rPr>
-              <w:t>8</w:t>
+              <w:t>30</w:t>
             </w:r>
           </w:p>
         </w:tc>
@@ -28659,7 +29412,7 @@
                 <w:sz w:val="16"/>
                 <w:szCs w:val="16"/>
               </w:rPr>
-              <w:t>180.4</w:t>
+              <w:t>202.4</w:t>
             </w:r>
           </w:p>
         </w:tc>
@@ -28822,7 +29575,7 @@
                 <w:sz w:val="16"/>
                 <w:szCs w:val="16"/>
               </w:rPr>
-              <w:t>0.4</w:t>
+              <w:t>1.5</w:t>
             </w:r>
           </w:p>
         </w:tc>
@@ -28882,7 +29635,7 @@
                 <w:sz w:val="16"/>
                 <w:szCs w:val="16"/>
               </w:rPr>
-              <w:t>1.8</w:t>
+              <w:t>2</w:t>
             </w:r>
           </w:p>
         </w:tc>
@@ -29319,7 +30072,7 @@
                 <w:sz w:val="16"/>
                 <w:szCs w:val="16"/>
               </w:rPr>
-              <w:t>0.1</w:t>
+              <w:t>0.3</w:t>
             </w:r>
           </w:p>
         </w:tc>
@@ -29540,67 +30293,67 @@
                 <w:sz w:val="16"/>
                 <w:szCs w:val="16"/>
               </w:rPr>
+              <w:t>2.7</w:t>
+            </w:r>
+          </w:p>
+        </w:tc>
+        <w:tc>
+          <w:tcPr>
+            <w:tcW w:w="1500" w:type="dxa"/>
+            <w:tcBorders>
+              <w:top w:val="single" w:sz="4" w:space="0" w:color="8497B0"/>
+              <w:left w:val="single" w:sz="4" w:space="0" w:color="8497B0"/>
+              <w:bottom w:val="single" w:sz="4" w:space="0" w:color="8497B0"/>
+              <w:right w:val="single" w:sz="4" w:space="0" w:color="8497B0"/>
+            </w:tcBorders>
+            <w:shd w:val="clear" w:color="auto" w:fill="EEF1F5"/>
+            <w:tcMar>
+              <w:top w:w="60" w:type="dxa"/>
+              <w:left w:w="100" w:type="dxa"/>
+              <w:bottom w:w="60" w:type="dxa"/>
+              <w:right w:w="100" w:type="dxa"/>
+            </w:tcMar>
+          </w:tcPr>
+          <w:p>
+            <w:pPr>
+              <w:spacing w:after="40"/>
+            </w:pPr>
+            <w:r>
+              <w:rPr>
+                <w:sz w:val="16"/>
+                <w:szCs w:val="16"/>
+              </w:rPr>
+              <w:t>2</w:t>
+            </w:r>
+          </w:p>
+        </w:tc>
+        <w:tc>
+          <w:tcPr>
+            <w:tcW w:w="1780" w:type="dxa"/>
+            <w:tcBorders>
+              <w:top w:val="single" w:sz="4" w:space="0" w:color="8497B0"/>
+              <w:left w:val="single" w:sz="4" w:space="0" w:color="8497B0"/>
+              <w:bottom w:val="single" w:sz="4" w:space="0" w:color="8497B0"/>
+              <w:right w:val="single" w:sz="4" w:space="0" w:color="8497B0"/>
+            </w:tcBorders>
+            <w:shd w:val="clear" w:color="auto" w:fill="EEF1F5"/>
+            <w:tcMar>
+              <w:top w:w="60" w:type="dxa"/>
+              <w:left w:w="100" w:type="dxa"/>
+              <w:bottom w:w="60" w:type="dxa"/>
+              <w:right w:w="100" w:type="dxa"/>
+            </w:tcMar>
+          </w:tcPr>
+          <w:p>
+            <w:pPr>
+              <w:spacing w:after="40"/>
+            </w:pPr>
+            <w:r>
+              <w:rPr>
+                <w:sz w:val="16"/>
+                <w:szCs w:val="16"/>
+              </w:rPr>
               <w:t>2.1</w:t>
-            </w:r>
-          </w:p>
-        </w:tc>
-        <w:tc>
-          <w:tcPr>
-            <w:tcW w:w="1500" w:type="dxa"/>
-            <w:tcBorders>
-              <w:top w:val="single" w:sz="4" w:space="0" w:color="8497B0"/>
-              <w:left w:val="single" w:sz="4" w:space="0" w:color="8497B0"/>
-              <w:bottom w:val="single" w:sz="4" w:space="0" w:color="8497B0"/>
-              <w:right w:val="single" w:sz="4" w:space="0" w:color="8497B0"/>
-            </w:tcBorders>
-            <w:shd w:val="clear" w:color="auto" w:fill="EEF1F5"/>
-            <w:tcMar>
-              <w:top w:w="60" w:type="dxa"/>
-              <w:left w:w="100" w:type="dxa"/>
-              <w:bottom w:w="60" w:type="dxa"/>
-              <w:right w:w="100" w:type="dxa"/>
-            </w:tcMar>
-          </w:tcPr>
-          <w:p>
-            <w:pPr>
-              <w:spacing w:after="40"/>
-            </w:pPr>
-            <w:r>
-              <w:rPr>
-                <w:sz w:val="16"/>
-                <w:szCs w:val="16"/>
-              </w:rPr>
-              <w:t>2</w:t>
-            </w:r>
-          </w:p>
-        </w:tc>
-        <w:tc>
-          <w:tcPr>
-            <w:tcW w:w="1780" w:type="dxa"/>
-            <w:tcBorders>
-              <w:top w:val="single" w:sz="4" w:space="0" w:color="8497B0"/>
-              <w:left w:val="single" w:sz="4" w:space="0" w:color="8497B0"/>
-              <w:bottom w:val="single" w:sz="4" w:space="0" w:color="8497B0"/>
-              <w:right w:val="single" w:sz="4" w:space="0" w:color="8497B0"/>
-            </w:tcBorders>
-            <w:shd w:val="clear" w:color="auto" w:fill="EEF1F5"/>
-            <w:tcMar>
-              <w:top w:w="60" w:type="dxa"/>
-              <w:left w:w="100" w:type="dxa"/>
-              <w:bottom w:w="60" w:type="dxa"/>
-              <w:right w:w="100" w:type="dxa"/>
-            </w:tcMar>
-          </w:tcPr>
-          <w:p>
-            <w:pPr>
-              <w:spacing w:after="40"/>
-            </w:pPr>
-            <w:r>
-              <w:rPr>
-                <w:sz w:val="16"/>
-                <w:szCs w:val="16"/>
-              </w:rPr>
-              <w:t>2</w:t>
             </w:r>
           </w:p>
         </w:tc>
@@ -29758,7 +30511,7 @@
                 <w:sz w:val="16"/>
                 <w:szCs w:val="16"/>
               </w:rPr>
-              <w:t>0.5</w:t>
+              <w:t>0.7</w:t>
             </w:r>
           </w:p>
         </w:tc>
@@ -29979,7 +30732,7 @@
                 <w:sz w:val="16"/>
                 <w:szCs w:val="16"/>
               </w:rPr>
-              <w:t>0.3</w:t>
+              <w:t>0.4</w:t>
             </w:r>
           </w:p>
         </w:tc>
@@ -30197,7 +30950,7 @@
                 <w:sz w:val="16"/>
                 <w:szCs w:val="16"/>
               </w:rPr>
-              <w:t>3</w:t>
+              <w:t>4.1</w:t>
             </w:r>
           </w:p>
         </w:tc>
@@ -30255,7 +31008,7 @@
                 <w:sz w:val="16"/>
                 <w:szCs w:val="16"/>
               </w:rPr>
-              <w:t>3.6</w:t>
+              <w:t>3.8</w:t>
             </w:r>
           </w:p>
         </w:tc>
@@ -30266,7 +31019,7 @@
         <w:spacing w:before="120" w:after="120" w:line="264" w:lineRule="auto"/>
       </w:pPr>
       <w:r>
-        <w:t>Phases 0–4 total about 355.9 MD (200.5 development, 36.7 design, 86.3 testing, 32.4 product management) – about 3.6 FTE on average for five months (peak 5.6 FTE in Phase 2), with development at about 56% of total effort. Of this, 81.4 MD (74 MD of features plus product management) are the additions from the RESPONSIBLE-AI roadmap review (section 1.3).</w:t>
+        <w:t>Phases 0–4 total about 377.9 MD (213.5 development, 39.7 design, 90.3 testing, 34.4 product management) – about 3.8 FTE on average for five months (peak 5.6 FTE in Phase 2), with development at about 56% of total effort. Of this, 103.4 MD (94 MD of features plus product management) are the additions from the RESPONSIBLE-AI roadmap review (section 1.3).</w:t>
       </w:r>
     </w:p>
     <w:p>
@@ -31085,7 +31838,7 @@
                 <w:sz w:val="16"/>
                 <w:szCs w:val="16"/>
               </w:rPr>
-              <w:t>55</w:t>
+              <w:t>75</w:t>
             </w:r>
           </w:p>
         </w:tc>
@@ -31115,7 +31868,7 @@
                 <w:sz w:val="16"/>
                 <w:szCs w:val="16"/>
               </w:rPr>
-              <w:t>15</w:t>
+              <w:t>35</w:t>
             </w:r>
           </w:p>
         </w:tc>
@@ -31145,7 +31898,7 @@
                 <w:sz w:val="16"/>
                 <w:szCs w:val="16"/>
               </w:rPr>
-              <w:t>Breakdown proposed (*); environment promotion 8 MD per the Activate team; prompt-injection detection revised to 4 MD (LiteLLM built-in detection). Plus † testing uplift (6 MD). Plus † app credentials, token exchange and gateway events (6 MD) and admin audit view (2 MD)</w:t>
+              <w:t>Breakdown proposed (*); environment promotion 8 MD per the Activate team; prompt-injection detection revised to 4 MD (LiteLLM built-in detection). Plus † testing uplift (6 MD). Plus † app credentials, token exchange and gateway events (6 MD) and admin audit view (2 MD). Plus † AWS integration (20 MD; 22 MD incl. PM) added in release 1.7</w:t>
             </w:r>
             <w:proofErr w:type="spellStart"/>
             <w:r>
@@ -31410,6 +32163,19 @@
       </w:pPr>
       <w:r>
         <w:t>Additions (†) from the RESPONSIBLE-AI-ENTERPRISEREADY Workflow Studio track (3 October 2026, release 1.6), 31 MD of feature effort plus 3.1 MD product management, all in Phase 2 (AI Apps): portal-native flow builder over the workflow engine API (14 MD); runs, template gallery, data picker and versions (8 MD); engine internal only, router / loop / code steps and OAuth2 connections (9 MD). The estimates are for the port to the Activate core and are proposals for the Activate team’s review. Risk: Phase 2 rises to 111.7 MD (5.6 FTE against 3.7 FTE in Phase 1); if that is too high, the engine-internal row (9 MD) can move to Phase 3.</w:t>
+      </w:r>
+    </w:p>
+    <w:p>
+      <w:pPr>
+        <w:pStyle w:val="ListParagraph"/>
+        <w:numPr>
+          <w:ilvl w:val="0"/>
+          <w:numId w:val="2"/>
+        </w:numPr>
+        <w:spacing w:after="60"/>
+      </w:pPr>
+      <w:r>
+        <w:t>Additions (†) from the RESPONSIBLE-AI-ENTERPRISEREADY AWS integration track (5 October 2026, release 1.7), 20 MD of feature effort plus 2 MD product management, all in Phase 3 (AI Apps): AWS pieces – Bedrock Agents, Bedrock Flows, OpenSearch and Amazon Quick Suite as workflow steps with the engine task role as identity (12 MD); MCP publishing – workflow apps exposed as tools of a gateway MCP server for external agents such as Quick Suite chat agents (8 MD). The estimates are for the port to the Activate core and are proposals for the Activate team’s review. Note: AI calls made inside Bedrock Agents, Bedrock Flows and Quick Suite run outside the LiteLLM proxy and are labelled as AWS-native AI in the Studio catalogue and step picker. Phase 3 rises to 82.5 MD (4.1 FTE); Phase 2 remains the peak phase.</w:t>
       </w:r>
     </w:p>
     <w:p>
@@ -31506,7 +32272,7 @@
         <w:spacing w:after="60"/>
       </w:pPr>
       <w:r>
-        <w:t>Load by phase: Phase 0 51.7 MD, Phase 1 73.7 MD, Phase 2 111.7 MD, Phase 3 60.5 MD, Phase 4 58.3 MD. The peak is Phase 2 at about 5.6 FTE; the plan is loaded between 2.6 and 5.6 FTE.</w:t>
+        <w:t>Load by phase: Phase 0 51.7 MD, Phase 1 73.7 MD, Phase 2 111.7 MD, Phase 3 82.5 MD, Phase 4 58.3 MD. The peak is Phase 2 at about 5.6 FTE; the plan is loaded between 2.6 and 5.6 FTE.</w:t>
       </w:r>
     </w:p>
     <w:p>
@@ -33095,7 +33861,7 @@
         <w:spacing w:before="120" w:after="120" w:line="264" w:lineRule="auto"/>
       </w:pPr>
       <w:r>
-        <w:t>Phases 0–4 (≈ 355.9 MD) plus the backlog (≈ 491 MD) gives about 846.9 MD to the full platform vision with AI-assisted delivery.</w:t>
+        <w:t>Phases 0–4 (≈ 377.9 MD) plus the backlog (≈ 491 MD) gives about 868.9 MD to the full platform vision with AI-assisted delivery.</w:t>
       </w:r>
     </w:p>
     <w:sectPr>

</xml_diff>